<commit_message>
lab 4 done i swear
</commit_message>
<xml_diff>
--- a/mathcad/Лабораторная-работа-4/ПРИ123-ММГО-#04-Нямаа.docx
+++ b/mathcad/Лабораторная-работа-4/ПРИ123-ММГО-#04-Нямаа.docx
@@ -335,7 +335,25 @@
           <w:sz w:val="24"/>
           <w:szCs w:val="24"/>
         </w:rPr>
-        <w:t>(ВлГУ)</w:t>
+        <w:t>(</w:t>
+      </w:r>
+      <w:proofErr w:type="spellStart"/>
+      <w:r>
+        <w:rPr>
+          <w:b/>
+          <w:sz w:val="24"/>
+          <w:szCs w:val="24"/>
+        </w:rPr>
+        <w:t>ВлГУ</w:t>
+      </w:r>
+      <w:proofErr w:type="spellEnd"/>
+      <w:r>
+        <w:rPr>
+          <w:b/>
+          <w:sz w:val="24"/>
+          <w:szCs w:val="24"/>
+        </w:rPr>
+        <w:t>)</w:t>
       </w:r>
     </w:p>
     <w:p>
@@ -686,8 +704,18 @@
           <w:sz w:val="28"/>
           <w:szCs w:val="28"/>
         </w:rPr>
-        <w:t>А.Ц. Нямаа</w:t>
-      </w:r>
+        <w:t xml:space="preserve">А.Ц. </w:t>
+      </w:r>
+      <w:proofErr w:type="spellStart"/>
+      <w:r>
+        <w:rPr>
+          <w:color w:val="000000" w:themeColor="text1"/>
+          <w:sz w:val="28"/>
+          <w:szCs w:val="28"/>
+        </w:rPr>
+        <w:t>Нямаа</w:t>
+      </w:r>
+      <w:proofErr w:type="spellEnd"/>
     </w:p>
     <w:p>
       <w:pPr>
@@ -845,7 +873,21 @@
         <w:rPr>
           <w:sz w:val="28"/>
         </w:rPr>
-        <w:t>в среде MathCAD.</w:t>
+        <w:t xml:space="preserve">в среде </w:t>
+      </w:r>
+      <w:proofErr w:type="spellStart"/>
+      <w:r>
+        <w:rPr>
+          <w:sz w:val="28"/>
+        </w:rPr>
+        <w:t>MathCAD</w:t>
+      </w:r>
+      <w:proofErr w:type="spellEnd"/>
+      <w:r>
+        <w:rPr>
+          <w:sz w:val="28"/>
+        </w:rPr>
+        <w:t>.</w:t>
       </w:r>
     </w:p>
     <w:p>
@@ -1054,14 +1096,14 @@
           <w:sz w:val="28"/>
           <w:szCs w:val="28"/>
         </w:rPr>
-        <w:t xml:space="preserve"> В ходе выполнения данного примера была построена прямая</w:t>
-      </w:r>
-      <w:r>
-        <w:rPr>
-          <w:sz w:val="28"/>
-          <w:szCs w:val="28"/>
-        </w:rPr>
-        <w:t>, заданная двумя точками, в пространстве.</w:t>
+        <w:t xml:space="preserve"> В ходе выполнения данного примера была построена </w:t>
+      </w:r>
+      <w:r>
+        <w:rPr>
+          <w:sz w:val="28"/>
+          <w:szCs w:val="28"/>
+        </w:rPr>
+        <w:t>прямая и плоскость в пространстве и найдены координаты точки их пересечения.</w:t>
       </w:r>
     </w:p>
     <w:p>
@@ -1076,6 +1118,49 @@
           <w:lang w:val="ru-RU"/>
         </w:rPr>
       </w:pPr>
+      <w:r>
+        <w:rPr>
+          <w:rFonts w:ascii="Times New Roman" w:hAnsi="Times New Roman"/>
+          <w:sz w:val="28"/>
+          <w:szCs w:val="28"/>
+          <w:lang w:val="ru-RU"/>
+        </w:rPr>
+        <w:drawing>
+          <wp:inline distT="0" distB="0" distL="0" distR="0" wp14:anchorId="1D4124B9" wp14:editId="111DCF61">
+            <wp:extent cx="3549271" cy="4892722"/>
+            <wp:effectExtent l="0" t="0" r="0" b="0"/>
+            <wp:docPr id="1" name="Рисунок 1"/>
+            <wp:cNvGraphicFramePr>
+              <a:graphicFrameLocks xmlns:a="http://schemas.openxmlformats.org/drawingml/2006/main" noChangeAspect="1"/>
+            </wp:cNvGraphicFramePr>
+            <a:graphic xmlns:a="http://schemas.openxmlformats.org/drawingml/2006/main">
+              <a:graphicData uri="http://schemas.openxmlformats.org/drawingml/2006/picture">
+                <pic:pic xmlns:pic="http://schemas.openxmlformats.org/drawingml/2006/picture">
+                  <pic:nvPicPr>
+                    <pic:cNvPr id="1" name=""/>
+                    <pic:cNvPicPr/>
+                  </pic:nvPicPr>
+                  <pic:blipFill>
+                    <a:blip r:embed="rId6"/>
+                    <a:stretch>
+                      <a:fillRect/>
+                    </a:stretch>
+                  </pic:blipFill>
+                  <pic:spPr>
+                    <a:xfrm>
+                      <a:off x="0" y="0"/>
+                      <a:ext cx="3587421" cy="4945312"/>
+                    </a:xfrm>
+                    <a:prstGeom prst="rect">
+                      <a:avLst/>
+                    </a:prstGeom>
+                  </pic:spPr>
+                </pic:pic>
+              </a:graphicData>
+            </a:graphic>
+          </wp:inline>
+        </w:drawing>
+      </w:r>
     </w:p>
     <w:p>
       <w:pPr>
@@ -1098,14 +1183,7 @@
           <w:sz w:val="28"/>
           <w:szCs w:val="28"/>
         </w:rPr>
-        <w:t>3</w:t>
-      </w:r>
-      <w:r>
-        <w:rPr>
-          <w:sz w:val="28"/>
-          <w:szCs w:val="28"/>
-        </w:rPr>
-        <w:t>.1</w:t>
+        <w:t>4.3</w:t>
       </w:r>
       <w:r>
         <w:rPr>
@@ -1114,6 +1192,119 @@
         </w:rPr>
         <w:t>.</w:t>
       </w:r>
+      <w:r>
+        <w:rPr>
+          <w:sz w:val="28"/>
+          <w:szCs w:val="28"/>
+        </w:rPr>
+        <w:t xml:space="preserve"> Часть 1.</w:t>
+      </w:r>
+    </w:p>
+    <w:p>
+      <w:pPr>
+        <w:spacing w:line="360" w:lineRule="auto"/>
+        <w:jc w:val="center"/>
+        <w:rPr>
+          <w:sz w:val="28"/>
+          <w:szCs w:val="28"/>
+        </w:rPr>
+      </w:pPr>
+      <w:r>
+        <w:rPr>
+          <w:sz w:val="28"/>
+          <w:szCs w:val="28"/>
+        </w:rPr>
+        <w:lastRenderedPageBreak/>
+        <w:drawing>
+          <wp:inline distT="0" distB="0" distL="0" distR="0" wp14:anchorId="1E1B8419" wp14:editId="75D6A7AE">
+            <wp:extent cx="3216484" cy="5090615"/>
+            <wp:effectExtent l="0" t="0" r="0" b="0"/>
+            <wp:docPr id="2" name="Рисунок 2"/>
+            <wp:cNvGraphicFramePr>
+              <a:graphicFrameLocks xmlns:a="http://schemas.openxmlformats.org/drawingml/2006/main" noChangeAspect="1"/>
+            </wp:cNvGraphicFramePr>
+            <a:graphic xmlns:a="http://schemas.openxmlformats.org/drawingml/2006/main">
+              <a:graphicData uri="http://schemas.openxmlformats.org/drawingml/2006/picture">
+                <pic:pic xmlns:pic="http://schemas.openxmlformats.org/drawingml/2006/picture">
+                  <pic:nvPicPr>
+                    <pic:cNvPr id="1" name=""/>
+                    <pic:cNvPicPr/>
+                  </pic:nvPicPr>
+                  <pic:blipFill>
+                    <a:blip r:embed="rId7"/>
+                    <a:stretch>
+                      <a:fillRect/>
+                    </a:stretch>
+                  </pic:blipFill>
+                  <pic:spPr>
+                    <a:xfrm>
+                      <a:off x="0" y="0"/>
+                      <a:ext cx="3259602" cy="5158857"/>
+                    </a:xfrm>
+                    <a:prstGeom prst="rect">
+                      <a:avLst/>
+                    </a:prstGeom>
+                  </pic:spPr>
+                </pic:pic>
+              </a:graphicData>
+            </a:graphic>
+          </wp:inline>
+        </w:drawing>
+      </w:r>
+    </w:p>
+    <w:p>
+      <w:pPr>
+        <w:spacing w:line="360" w:lineRule="auto"/>
+        <w:jc w:val="center"/>
+        <w:rPr>
+          <w:sz w:val="28"/>
+          <w:szCs w:val="28"/>
+        </w:rPr>
+      </w:pPr>
+      <w:r>
+        <w:rPr>
+          <w:sz w:val="28"/>
+          <w:szCs w:val="28"/>
+        </w:rPr>
+        <w:t xml:space="preserve">Рисунок </w:t>
+      </w:r>
+      <w:r>
+        <w:rPr>
+          <w:sz w:val="28"/>
+          <w:szCs w:val="28"/>
+        </w:rPr>
+        <w:t>2</w:t>
+      </w:r>
+      <w:r>
+        <w:rPr>
+          <w:sz w:val="28"/>
+          <w:szCs w:val="28"/>
+        </w:rPr>
+        <w:t xml:space="preserve">. Выполнение пример 4.3. Часть </w:t>
+      </w:r>
+      <w:r>
+        <w:rPr>
+          <w:sz w:val="28"/>
+          <w:szCs w:val="28"/>
+        </w:rPr>
+        <w:t>2</w:t>
+      </w:r>
+      <w:r>
+        <w:rPr>
+          <w:sz w:val="28"/>
+          <w:szCs w:val="28"/>
+        </w:rPr>
+        <w:t>.</w:t>
+      </w:r>
+    </w:p>
+    <w:p>
+      <w:pPr>
+        <w:spacing w:line="360" w:lineRule="auto"/>
+        <w:jc w:val="center"/>
+        <w:rPr>
+          <w:sz w:val="20"/>
+        </w:rPr>
+      </w:pPr>
     </w:p>
     <w:p>
       <w:pPr>
@@ -1175,8 +1366,255 @@
           <w:sz w:val="28"/>
           <w:szCs w:val="28"/>
         </w:rPr>
-        <w:t xml:space="preserve"> В ходе выполнения данного примера была построена прямая, заданная двумя точками, в пространстве.</w:t>
-      </w:r>
+        <w:t xml:space="preserve"> В ходе выполнения данного примера </w:t>
+      </w:r>
+      <w:r>
+        <w:rPr>
+          <w:sz w:val="28"/>
+          <w:szCs w:val="28"/>
+        </w:rPr>
+        <w:t>была построена плоскость, параллельн</w:t>
+      </w:r>
+      <w:r>
+        <w:rPr>
+          <w:sz w:val="28"/>
+          <w:szCs w:val="28"/>
+        </w:rPr>
+        <w:t>о</w:t>
+      </w:r>
+      <w:r>
+        <w:rPr>
+          <w:sz w:val="28"/>
+          <w:szCs w:val="28"/>
+        </w:rPr>
+        <w:t xml:space="preserve"> заданной.</w:t>
+      </w:r>
+    </w:p>
+    <w:p>
+      <w:pPr>
+        <w:spacing w:line="360" w:lineRule="auto"/>
+        <w:ind w:hanging="142"/>
+        <w:jc w:val="center"/>
+        <w:rPr>
+          <w:sz w:val="28"/>
+          <w:szCs w:val="28"/>
+        </w:rPr>
+      </w:pPr>
+      <w:r>
+        <w:rPr>
+          <w:sz w:val="28"/>
+          <w:szCs w:val="28"/>
+        </w:rPr>
+        <w:drawing>
+          <wp:inline distT="0" distB="0" distL="0" distR="0" wp14:anchorId="7289C309" wp14:editId="29E11E5B">
+            <wp:extent cx="2968389" cy="2554939"/>
+            <wp:effectExtent l="0" t="0" r="0" b="0"/>
+            <wp:docPr id="3" name="Рисунок 3"/>
+            <wp:cNvGraphicFramePr>
+              <a:graphicFrameLocks xmlns:a="http://schemas.openxmlformats.org/drawingml/2006/main" noChangeAspect="1"/>
+            </wp:cNvGraphicFramePr>
+            <a:graphic xmlns:a="http://schemas.openxmlformats.org/drawingml/2006/main">
+              <a:graphicData uri="http://schemas.openxmlformats.org/drawingml/2006/picture">
+                <pic:pic xmlns:pic="http://schemas.openxmlformats.org/drawingml/2006/picture">
+                  <pic:nvPicPr>
+                    <pic:cNvPr id="1" name=""/>
+                    <pic:cNvPicPr/>
+                  </pic:nvPicPr>
+                  <pic:blipFill>
+                    <a:blip r:embed="rId8"/>
+                    <a:stretch>
+                      <a:fillRect/>
+                    </a:stretch>
+                  </pic:blipFill>
+                  <pic:spPr>
+                    <a:xfrm>
+                      <a:off x="0" y="0"/>
+                      <a:ext cx="3016747" cy="2596561"/>
+                    </a:xfrm>
+                    <a:prstGeom prst="rect">
+                      <a:avLst/>
+                    </a:prstGeom>
+                  </pic:spPr>
+                </pic:pic>
+              </a:graphicData>
+            </a:graphic>
+          </wp:inline>
+        </w:drawing>
+      </w:r>
+    </w:p>
+    <w:p>
+      <w:pPr>
+        <w:spacing w:line="360" w:lineRule="auto"/>
+        <w:jc w:val="center"/>
+        <w:rPr>
+          <w:sz w:val="28"/>
+          <w:szCs w:val="28"/>
+        </w:rPr>
+      </w:pPr>
+      <w:r>
+        <w:rPr>
+          <w:sz w:val="28"/>
+          <w:szCs w:val="28"/>
+        </w:rPr>
+        <w:t xml:space="preserve">Рисунок </w:t>
+      </w:r>
+      <w:r>
+        <w:rPr>
+          <w:sz w:val="28"/>
+          <w:szCs w:val="28"/>
+        </w:rPr>
+        <w:t>3</w:t>
+      </w:r>
+      <w:r>
+        <w:rPr>
+          <w:sz w:val="28"/>
+          <w:szCs w:val="28"/>
+        </w:rPr>
+        <w:t>. Выполнение пример 4.</w:t>
+      </w:r>
+      <w:r>
+        <w:rPr>
+          <w:sz w:val="28"/>
+          <w:szCs w:val="28"/>
+        </w:rPr>
+        <w:t>4</w:t>
+      </w:r>
+      <w:r>
+        <w:rPr>
+          <w:sz w:val="28"/>
+          <w:szCs w:val="28"/>
+        </w:rPr>
+        <w:t xml:space="preserve">. Часть </w:t>
+      </w:r>
+      <w:r>
+        <w:rPr>
+          <w:sz w:val="28"/>
+          <w:szCs w:val="28"/>
+        </w:rPr>
+        <w:t>1</w:t>
+      </w:r>
+      <w:r>
+        <w:rPr>
+          <w:sz w:val="28"/>
+          <w:szCs w:val="28"/>
+        </w:rPr>
+        <w:t>.</w:t>
+      </w:r>
+    </w:p>
+    <w:p>
+      <w:pPr>
+        <w:spacing w:line="360" w:lineRule="auto"/>
+        <w:ind w:hanging="142"/>
+        <w:jc w:val="center"/>
+        <w:rPr>
+          <w:sz w:val="28"/>
+          <w:szCs w:val="28"/>
+        </w:rPr>
+      </w:pPr>
+      <w:r>
+        <w:rPr>
+          <w:sz w:val="28"/>
+          <w:szCs w:val="28"/>
+        </w:rPr>
+        <w:lastRenderedPageBreak/>
+        <w:drawing>
+          <wp:inline distT="0" distB="0" distL="0" distR="0" wp14:anchorId="64DC912B" wp14:editId="5FF57CEA">
+            <wp:extent cx="3743209" cy="4135272"/>
+            <wp:effectExtent l="0" t="0" r="0" b="0"/>
+            <wp:docPr id="4" name="Рисунок 4"/>
+            <wp:cNvGraphicFramePr>
+              <a:graphicFrameLocks xmlns:a="http://schemas.openxmlformats.org/drawingml/2006/main" noChangeAspect="1"/>
+            </wp:cNvGraphicFramePr>
+            <a:graphic xmlns:a="http://schemas.openxmlformats.org/drawingml/2006/main">
+              <a:graphicData uri="http://schemas.openxmlformats.org/drawingml/2006/picture">
+                <pic:pic xmlns:pic="http://schemas.openxmlformats.org/drawingml/2006/picture">
+                  <pic:nvPicPr>
+                    <pic:cNvPr id="1" name=""/>
+                    <pic:cNvPicPr/>
+                  </pic:nvPicPr>
+                  <pic:blipFill rotWithShape="1">
+                    <a:blip r:embed="rId9"/>
+                    <a:srcRect t="826" b="1313"/>
+                    <a:stretch/>
+                  </pic:blipFill>
+                  <pic:spPr bwMode="auto">
+                    <a:xfrm>
+                      <a:off x="0" y="0"/>
+                      <a:ext cx="3779729" cy="4175617"/>
+                    </a:xfrm>
+                    <a:prstGeom prst="rect">
+                      <a:avLst/>
+                    </a:prstGeom>
+                    <a:ln>
+                      <a:noFill/>
+                    </a:ln>
+                    <a:extLst>
+                      <a:ext uri="{53640926-AAD7-44D8-BBD7-CCE9431645EC}">
+                        <a14:shadowObscured xmlns:a14="http://schemas.microsoft.com/office/drawing/2010/main"/>
+                      </a:ext>
+                    </a:extLst>
+                  </pic:spPr>
+                </pic:pic>
+              </a:graphicData>
+            </a:graphic>
+          </wp:inline>
+        </w:drawing>
+      </w:r>
+    </w:p>
+    <w:p>
+      <w:pPr>
+        <w:spacing w:line="360" w:lineRule="auto"/>
+        <w:jc w:val="center"/>
+        <w:rPr>
+          <w:sz w:val="28"/>
+          <w:szCs w:val="28"/>
+        </w:rPr>
+      </w:pPr>
+      <w:r>
+        <w:rPr>
+          <w:sz w:val="28"/>
+          <w:szCs w:val="28"/>
+        </w:rPr>
+        <w:t xml:space="preserve">Рисунок </w:t>
+      </w:r>
+      <w:r>
+        <w:rPr>
+          <w:sz w:val="28"/>
+          <w:szCs w:val="28"/>
+        </w:rPr>
+        <w:t>4</w:t>
+      </w:r>
+      <w:r>
+        <w:rPr>
+          <w:sz w:val="28"/>
+          <w:szCs w:val="28"/>
+        </w:rPr>
+        <w:t xml:space="preserve">. Выполнение пример 4.4. Часть </w:t>
+      </w:r>
+      <w:r>
+        <w:rPr>
+          <w:sz w:val="28"/>
+          <w:szCs w:val="28"/>
+        </w:rPr>
+        <w:t>2</w:t>
+      </w:r>
+      <w:r>
+        <w:rPr>
+          <w:sz w:val="28"/>
+          <w:szCs w:val="28"/>
+        </w:rPr>
+        <w:t>.</w:t>
+      </w:r>
+    </w:p>
+    <w:p>
+      <w:pPr>
+        <w:spacing w:line="360" w:lineRule="auto"/>
+        <w:jc w:val="both"/>
+        <w:rPr>
+          <w:sz w:val="28"/>
+          <w:szCs w:val="28"/>
+        </w:rPr>
+      </w:pPr>
     </w:p>
     <w:p>
       <w:pPr>
@@ -1238,7 +1676,265 @@
           <w:sz w:val="28"/>
           <w:szCs w:val="28"/>
         </w:rPr>
-        <w:t xml:space="preserve"> В ходе выполнения данного примера была построена прямая, заданная двумя точками, в пространстве.</w:t>
+        <w:t xml:space="preserve"> В ходе выполнения данного примера была построена </w:t>
+      </w:r>
+      <w:r>
+        <w:rPr>
+          <w:sz w:val="28"/>
+          <w:szCs w:val="28"/>
+        </w:rPr>
+        <w:t>плоскость, перпендикулярно заданной.</w:t>
+      </w:r>
+    </w:p>
+    <w:p>
+      <w:pPr>
+        <w:spacing w:line="360" w:lineRule="auto"/>
+        <w:jc w:val="center"/>
+        <w:rPr>
+          <w:sz w:val="28"/>
+          <w:szCs w:val="28"/>
+        </w:rPr>
+      </w:pPr>
+      <w:r>
+        <w:rPr>
+          <w:sz w:val="28"/>
+          <w:szCs w:val="28"/>
+        </w:rPr>
+        <w:drawing>
+          <wp:inline distT="0" distB="0" distL="0" distR="0" wp14:anchorId="4380877E" wp14:editId="1D52ADD3">
+            <wp:extent cx="3890955" cy="2886501"/>
+            <wp:effectExtent l="0" t="0" r="0" b="0"/>
+            <wp:docPr id="7" name="Рисунок 7"/>
+            <wp:cNvGraphicFramePr>
+              <a:graphicFrameLocks xmlns:a="http://schemas.openxmlformats.org/drawingml/2006/main" noChangeAspect="1"/>
+            </wp:cNvGraphicFramePr>
+            <a:graphic xmlns:a="http://schemas.openxmlformats.org/drawingml/2006/main">
+              <a:graphicData uri="http://schemas.openxmlformats.org/drawingml/2006/picture">
+                <pic:pic xmlns:pic="http://schemas.openxmlformats.org/drawingml/2006/picture">
+                  <pic:nvPicPr>
+                    <pic:cNvPr id="1" name=""/>
+                    <pic:cNvPicPr/>
+                  </pic:nvPicPr>
+                  <pic:blipFill>
+                    <a:blip r:embed="rId10"/>
+                    <a:stretch>
+                      <a:fillRect/>
+                    </a:stretch>
+                  </pic:blipFill>
+                  <pic:spPr>
+                    <a:xfrm>
+                      <a:off x="0" y="0"/>
+                      <a:ext cx="3904569" cy="2896600"/>
+                    </a:xfrm>
+                    <a:prstGeom prst="rect">
+                      <a:avLst/>
+                    </a:prstGeom>
+                  </pic:spPr>
+                </pic:pic>
+              </a:graphicData>
+            </a:graphic>
+          </wp:inline>
+        </w:drawing>
+      </w:r>
+    </w:p>
+    <w:p>
+      <w:pPr>
+        <w:spacing w:line="360" w:lineRule="auto"/>
+        <w:jc w:val="center"/>
+        <w:rPr>
+          <w:sz w:val="28"/>
+          <w:szCs w:val="28"/>
+        </w:rPr>
+      </w:pPr>
+      <w:r>
+        <w:rPr>
+          <w:sz w:val="28"/>
+          <w:szCs w:val="28"/>
+        </w:rPr>
+        <w:t xml:space="preserve">Рисунок </w:t>
+      </w:r>
+      <w:r>
+        <w:rPr>
+          <w:sz w:val="28"/>
+          <w:szCs w:val="28"/>
+        </w:rPr>
+        <w:t>5</w:t>
+      </w:r>
+      <w:r>
+        <w:rPr>
+          <w:sz w:val="28"/>
+          <w:szCs w:val="28"/>
+        </w:rPr>
+        <w:t>. Выполнение пример 4.</w:t>
+      </w:r>
+      <w:r>
+        <w:rPr>
+          <w:sz w:val="28"/>
+          <w:szCs w:val="28"/>
+        </w:rPr>
+        <w:t>5</w:t>
+      </w:r>
+      <w:r>
+        <w:rPr>
+          <w:sz w:val="28"/>
+          <w:szCs w:val="28"/>
+        </w:rPr>
+        <w:t xml:space="preserve">. Часть </w:t>
+      </w:r>
+      <w:r>
+        <w:rPr>
+          <w:sz w:val="28"/>
+          <w:szCs w:val="28"/>
+        </w:rPr>
+        <w:t>1</w:t>
+      </w:r>
+      <w:r>
+        <w:rPr>
+          <w:sz w:val="28"/>
+          <w:szCs w:val="28"/>
+        </w:rPr>
+        <w:t>.</w:t>
+      </w:r>
+    </w:p>
+    <w:p>
+      <w:pPr>
+        <w:spacing w:line="360" w:lineRule="auto"/>
+        <w:jc w:val="center"/>
+        <w:rPr>
+          <w:sz w:val="28"/>
+          <w:szCs w:val="28"/>
+        </w:rPr>
+      </w:pPr>
+    </w:p>
+    <w:p>
+      <w:pPr>
+        <w:spacing w:line="360" w:lineRule="auto"/>
+        <w:jc w:val="center"/>
+        <w:rPr>
+          <w:sz w:val="28"/>
+          <w:szCs w:val="28"/>
+        </w:rPr>
+      </w:pPr>
+      <w:r>
+        <w:rPr>
+          <w:sz w:val="28"/>
+          <w:szCs w:val="28"/>
+        </w:rPr>
+        <w:lastRenderedPageBreak/>
+        <w:drawing>
+          <wp:inline distT="0" distB="0" distL="0" distR="0" wp14:anchorId="0FB80885" wp14:editId="29232322">
+            <wp:extent cx="3725429" cy="2524836"/>
+            <wp:effectExtent l="0" t="0" r="0" b="0"/>
+            <wp:docPr id="8" name="Рисунок 8"/>
+            <wp:cNvGraphicFramePr>
+              <a:graphicFrameLocks xmlns:a="http://schemas.openxmlformats.org/drawingml/2006/main" noChangeAspect="1"/>
+            </wp:cNvGraphicFramePr>
+            <a:graphic xmlns:a="http://schemas.openxmlformats.org/drawingml/2006/main">
+              <a:graphicData uri="http://schemas.openxmlformats.org/drawingml/2006/picture">
+                <pic:pic xmlns:pic="http://schemas.openxmlformats.org/drawingml/2006/picture">
+                  <pic:nvPicPr>
+                    <pic:cNvPr id="1" name=""/>
+                    <pic:cNvPicPr/>
+                  </pic:nvPicPr>
+                  <pic:blipFill rotWithShape="1">
+                    <a:blip r:embed="rId11"/>
+                    <a:srcRect l="3905" r="3731"/>
+                    <a:stretch/>
+                  </pic:blipFill>
+                  <pic:spPr bwMode="auto">
+                    <a:xfrm>
+                      <a:off x="0" y="0"/>
+                      <a:ext cx="3747912" cy="2540073"/>
+                    </a:xfrm>
+                    <a:prstGeom prst="rect">
+                      <a:avLst/>
+                    </a:prstGeom>
+                    <a:ln>
+                      <a:noFill/>
+                    </a:ln>
+                    <a:extLst>
+                      <a:ext uri="{53640926-AAD7-44D8-BBD7-CCE9431645EC}">
+                        <a14:shadowObscured xmlns:a14="http://schemas.microsoft.com/office/drawing/2010/main"/>
+                      </a:ext>
+                    </a:extLst>
+                  </pic:spPr>
+                </pic:pic>
+              </a:graphicData>
+            </a:graphic>
+          </wp:inline>
+        </w:drawing>
+      </w:r>
+    </w:p>
+    <w:p>
+      <w:pPr>
+        <w:spacing w:line="360" w:lineRule="auto"/>
+        <w:jc w:val="center"/>
+        <w:rPr>
+          <w:sz w:val="28"/>
+          <w:szCs w:val="28"/>
+        </w:rPr>
+      </w:pPr>
+      <w:r>
+        <w:rPr>
+          <w:sz w:val="28"/>
+          <w:szCs w:val="28"/>
+        </w:rPr>
+        <w:t xml:space="preserve">Рисунок </w:t>
+      </w:r>
+      <w:r>
+        <w:rPr>
+          <w:sz w:val="28"/>
+          <w:szCs w:val="28"/>
+        </w:rPr>
+        <w:t>6</w:t>
+      </w:r>
+      <w:r>
+        <w:rPr>
+          <w:sz w:val="28"/>
+          <w:szCs w:val="28"/>
+        </w:rPr>
+        <w:t xml:space="preserve">. Выполнение пример 4.5. Часть </w:t>
+      </w:r>
+      <w:r>
+        <w:rPr>
+          <w:sz w:val="28"/>
+          <w:szCs w:val="28"/>
+        </w:rPr>
+        <w:t>2</w:t>
+      </w:r>
+      <w:r>
+        <w:rPr>
+          <w:sz w:val="28"/>
+          <w:szCs w:val="28"/>
+        </w:rPr>
+        <w:t>.</w:t>
+      </w:r>
+    </w:p>
+    <w:p>
+      <w:pPr>
+        <w:spacing w:line="360" w:lineRule="auto"/>
+        <w:jc w:val="center"/>
+        <w:rPr>
+          <w:sz w:val="28"/>
+          <w:szCs w:val="28"/>
+        </w:rPr>
+      </w:pPr>
+    </w:p>
+    <w:p>
+      <w:pPr>
+        <w:spacing w:line="360" w:lineRule="auto"/>
+        <w:jc w:val="center"/>
+        <w:rPr>
+          <w:sz w:val="28"/>
+          <w:szCs w:val="28"/>
+        </w:rPr>
+      </w:pPr>
+      <w:r>
+        <w:rPr>
+          <w:sz w:val="28"/>
+          <w:szCs w:val="28"/>
+        </w:rPr>
+        <w:t>ЗАДАНИЕ 2 (вариант 14).</w:t>
       </w:r>
     </w:p>
     <w:p>
@@ -1249,24 +1945,382 @@
         <w:rPr>
           <w:sz w:val="28"/>
           <w:szCs w:val="28"/>
-        </w:rPr>
-      </w:pPr>
-    </w:p>
-    <w:p>
-      <w:pPr>
-        <w:spacing w:line="360" w:lineRule="auto"/>
-        <w:jc w:val="center"/>
-        <w:rPr>
-          <w:sz w:val="28"/>
-          <w:szCs w:val="28"/>
-        </w:rPr>
-      </w:pPr>
-      <w:r>
-        <w:rPr>
-          <w:sz w:val="28"/>
-          <w:szCs w:val="28"/>
-        </w:rPr>
-        <w:t>ЗАДАНИЕ 2 (вариант 14).</w:t>
+          <w:lang w:val="en-US"/>
+        </w:rPr>
+      </w:pPr>
+      <w:r>
+        <w:rPr>
+          <w:sz w:val="28"/>
+          <w:szCs w:val="28"/>
+        </w:rPr>
+        <w:t>В таблице заданы варианты координат точек в пространстве: A</w:t>
+      </w:r>
+      <w:r>
+        <w:rPr>
+          <w:sz w:val="28"/>
+          <w:szCs w:val="28"/>
+        </w:rPr>
+        <w:t xml:space="preserve"> (</w:t>
+      </w:r>
+      <w:r>
+        <w:rPr>
+          <w:sz w:val="28"/>
+          <w:szCs w:val="28"/>
+        </w:rPr>
+        <w:t>XA</w:t>
+      </w:r>
+      <w:r>
+        <w:rPr>
+          <w:sz w:val="28"/>
+          <w:szCs w:val="28"/>
+        </w:rPr>
+        <w:t xml:space="preserve"> = 3,</w:t>
+      </w:r>
+      <w:r>
+        <w:rPr>
+          <w:sz w:val="28"/>
+          <w:szCs w:val="28"/>
+        </w:rPr>
+        <w:t xml:space="preserve"> YA</w:t>
+      </w:r>
+      <w:r>
+        <w:rPr>
+          <w:sz w:val="28"/>
+          <w:szCs w:val="28"/>
+        </w:rPr>
+        <w:t xml:space="preserve"> = 16,</w:t>
+      </w:r>
+      <w:r>
+        <w:rPr>
+          <w:sz w:val="28"/>
+          <w:szCs w:val="28"/>
+        </w:rPr>
+        <w:t xml:space="preserve"> ZA </w:t>
+      </w:r>
+      <w:r>
+        <w:rPr>
+          <w:sz w:val="28"/>
+          <w:szCs w:val="28"/>
+        </w:rPr>
+        <w:t>= 10)</w:t>
+      </w:r>
+      <w:r>
+        <w:rPr>
+          <w:sz w:val="28"/>
+          <w:szCs w:val="28"/>
+        </w:rPr>
+        <w:t>, B</w:t>
+      </w:r>
+      <w:r>
+        <w:rPr>
+          <w:sz w:val="28"/>
+          <w:szCs w:val="28"/>
+        </w:rPr>
+        <w:t xml:space="preserve"> (</w:t>
+      </w:r>
+      <w:r>
+        <w:rPr>
+          <w:sz w:val="28"/>
+          <w:szCs w:val="28"/>
+        </w:rPr>
+        <w:t>XB</w:t>
+      </w:r>
+      <w:r>
+        <w:rPr>
+          <w:sz w:val="28"/>
+          <w:szCs w:val="28"/>
+        </w:rPr>
+        <w:t xml:space="preserve"> = 15,</w:t>
+      </w:r>
+      <w:r>
+        <w:rPr>
+          <w:sz w:val="28"/>
+          <w:szCs w:val="28"/>
+        </w:rPr>
+        <w:t xml:space="preserve"> YB</w:t>
+      </w:r>
+      <w:r>
+        <w:rPr>
+          <w:sz w:val="28"/>
+          <w:szCs w:val="28"/>
+        </w:rPr>
+        <w:t xml:space="preserve"> = 9,</w:t>
+      </w:r>
+      <w:r>
+        <w:rPr>
+          <w:sz w:val="28"/>
+          <w:szCs w:val="28"/>
+        </w:rPr>
+        <w:t xml:space="preserve"> ZB</w:t>
+      </w:r>
+      <w:r>
+        <w:rPr>
+          <w:sz w:val="28"/>
+          <w:szCs w:val="28"/>
+        </w:rPr>
+        <w:t xml:space="preserve"> = 16)</w:t>
+      </w:r>
+      <w:r>
+        <w:rPr>
+          <w:sz w:val="28"/>
+          <w:szCs w:val="28"/>
+        </w:rPr>
+        <w:t>, C</w:t>
+      </w:r>
+      <w:r>
+        <w:rPr>
+          <w:sz w:val="28"/>
+          <w:szCs w:val="28"/>
+        </w:rPr>
+        <w:t xml:space="preserve"> </w:t>
+      </w:r>
+      <w:r>
+        <w:rPr>
+          <w:sz w:val="28"/>
+          <w:szCs w:val="28"/>
+        </w:rPr>
+        <w:t>(</w:t>
+      </w:r>
+      <w:r>
+        <w:rPr>
+          <w:sz w:val="28"/>
+          <w:szCs w:val="28"/>
+        </w:rPr>
+        <w:t>XC</w:t>
+      </w:r>
+      <w:r>
+        <w:rPr>
+          <w:sz w:val="28"/>
+          <w:szCs w:val="28"/>
+        </w:rPr>
+        <w:t xml:space="preserve"> = 16,</w:t>
+      </w:r>
+      <w:r>
+        <w:rPr>
+          <w:sz w:val="28"/>
+          <w:szCs w:val="28"/>
+        </w:rPr>
+        <w:t xml:space="preserve"> YC</w:t>
+      </w:r>
+      <w:r>
+        <w:rPr>
+          <w:sz w:val="28"/>
+          <w:szCs w:val="28"/>
+        </w:rPr>
+        <w:t xml:space="preserve"> = 17,</w:t>
+      </w:r>
+      <w:r>
+        <w:rPr>
+          <w:sz w:val="28"/>
+          <w:szCs w:val="28"/>
+        </w:rPr>
+        <w:t xml:space="preserve"> ZC</w:t>
+      </w:r>
+      <w:r>
+        <w:rPr>
+          <w:sz w:val="28"/>
+          <w:szCs w:val="28"/>
+        </w:rPr>
+        <w:t xml:space="preserve"> = 9)</w:t>
+      </w:r>
+      <w:r>
+        <w:rPr>
+          <w:sz w:val="28"/>
+          <w:szCs w:val="28"/>
+        </w:rPr>
+        <w:t>, M</w:t>
+      </w:r>
+      <w:r>
+        <w:rPr>
+          <w:sz w:val="28"/>
+          <w:szCs w:val="28"/>
+        </w:rPr>
+        <w:t xml:space="preserve"> (</w:t>
+      </w:r>
+      <w:r>
+        <w:rPr>
+          <w:sz w:val="28"/>
+          <w:szCs w:val="28"/>
+        </w:rPr>
+        <w:t>XM</w:t>
+      </w:r>
+      <w:r>
+        <w:rPr>
+          <w:sz w:val="28"/>
+          <w:szCs w:val="28"/>
+        </w:rPr>
+        <w:t xml:space="preserve"> = 4,</w:t>
+      </w:r>
+      <w:r>
+        <w:rPr>
+          <w:sz w:val="28"/>
+          <w:szCs w:val="28"/>
+        </w:rPr>
+        <w:t xml:space="preserve"> YM</w:t>
+      </w:r>
+      <w:r>
+        <w:rPr>
+          <w:sz w:val="28"/>
+          <w:szCs w:val="28"/>
+        </w:rPr>
+        <w:t xml:space="preserve"> = 4,</w:t>
+      </w:r>
+      <w:r>
+        <w:rPr>
+          <w:sz w:val="28"/>
+          <w:szCs w:val="28"/>
+        </w:rPr>
+        <w:t xml:space="preserve"> ZM</w:t>
+      </w:r>
+      <w:r>
+        <w:rPr>
+          <w:sz w:val="28"/>
+          <w:szCs w:val="28"/>
+        </w:rPr>
+        <w:t xml:space="preserve"> = 8)</w:t>
+      </w:r>
+      <w:r>
+        <w:rPr>
+          <w:sz w:val="28"/>
+          <w:szCs w:val="28"/>
+        </w:rPr>
+        <w:t>, N</w:t>
+      </w:r>
+      <w:r>
+        <w:rPr>
+          <w:sz w:val="28"/>
+          <w:szCs w:val="28"/>
+        </w:rPr>
+        <w:t xml:space="preserve"> (</w:t>
+      </w:r>
+      <w:r>
+        <w:rPr>
+          <w:sz w:val="28"/>
+          <w:szCs w:val="28"/>
+        </w:rPr>
+        <w:t>XN</w:t>
+      </w:r>
+      <w:r>
+        <w:rPr>
+          <w:sz w:val="28"/>
+          <w:szCs w:val="28"/>
+        </w:rPr>
+        <w:t xml:space="preserve"> = 6,</w:t>
+      </w:r>
+      <w:r>
+        <w:rPr>
+          <w:sz w:val="28"/>
+          <w:szCs w:val="28"/>
+        </w:rPr>
+        <w:t xml:space="preserve"> YN</w:t>
+      </w:r>
+      <w:r>
+        <w:rPr>
+          <w:sz w:val="28"/>
+          <w:szCs w:val="28"/>
+        </w:rPr>
+        <w:t xml:space="preserve"> = 0,</w:t>
+      </w:r>
+      <w:r>
+        <w:rPr>
+          <w:sz w:val="28"/>
+          <w:szCs w:val="28"/>
+        </w:rPr>
+        <w:t xml:space="preserve"> ZN</w:t>
+      </w:r>
+      <w:r>
+        <w:rPr>
+          <w:sz w:val="28"/>
+          <w:szCs w:val="28"/>
+        </w:rPr>
+        <w:t xml:space="preserve"> = 18)</w:t>
+      </w:r>
+      <w:r>
+        <w:rPr>
+          <w:sz w:val="28"/>
+          <w:szCs w:val="28"/>
+        </w:rPr>
+        <w:t>, P</w:t>
+      </w:r>
+      <w:r>
+        <w:rPr>
+          <w:sz w:val="28"/>
+          <w:szCs w:val="28"/>
+        </w:rPr>
+        <w:t>(</w:t>
+      </w:r>
+      <w:r>
+        <w:rPr>
+          <w:sz w:val="28"/>
+          <w:szCs w:val="28"/>
+        </w:rPr>
+        <w:t>XP</w:t>
+      </w:r>
+      <w:r>
+        <w:rPr>
+          <w:sz w:val="28"/>
+          <w:szCs w:val="28"/>
+        </w:rPr>
+        <w:t xml:space="preserve"> = 14,</w:t>
+      </w:r>
+      <w:r>
+        <w:rPr>
+          <w:sz w:val="28"/>
+          <w:szCs w:val="28"/>
+        </w:rPr>
+        <w:t xml:space="preserve"> YP</w:t>
+      </w:r>
+      <w:r>
+        <w:rPr>
+          <w:sz w:val="28"/>
+          <w:szCs w:val="28"/>
+        </w:rPr>
+        <w:t xml:space="preserve"> = 0,</w:t>
+      </w:r>
+      <w:r>
+        <w:rPr>
+          <w:sz w:val="28"/>
+          <w:szCs w:val="28"/>
+        </w:rPr>
+        <w:t xml:space="preserve"> ZP</w:t>
+      </w:r>
+      <w:r>
+        <w:rPr>
+          <w:sz w:val="28"/>
+          <w:szCs w:val="28"/>
+        </w:rPr>
+        <w:t xml:space="preserve"> = 4)</w:t>
+      </w:r>
+      <w:r>
+        <w:rPr>
+          <w:sz w:val="28"/>
+          <w:szCs w:val="28"/>
+        </w:rPr>
+        <w:t>. Построить в декартовой системе координат треугольник ABC, прямую NM и точку P разными цветами</w:t>
+      </w:r>
+      <w:r>
+        <w:rPr>
+          <w:sz w:val="28"/>
+          <w:szCs w:val="28"/>
+        </w:rPr>
+        <w:t>.</w:t>
+      </w:r>
+    </w:p>
+    <w:p>
+      <w:pPr>
+        <w:spacing w:line="360" w:lineRule="auto"/>
+        <w:jc w:val="center"/>
+        <w:rPr>
+          <w:sz w:val="28"/>
+          <w:szCs w:val="28"/>
+        </w:rPr>
+      </w:pPr>
+      <w:r>
+        <w:rPr>
+          <w:sz w:val="28"/>
+          <w:szCs w:val="28"/>
+        </w:rPr>
+        <w:t>ВЫПОЛНЕНИЕ РАБОТЫ:</w:t>
       </w:r>
     </w:p>
     <w:p>
@@ -1284,350 +2338,117 @@
           <w:sz w:val="28"/>
           <w:szCs w:val="28"/>
         </w:rPr>
-        <w:t>В таблице заданы варианты координат точек в пространстве: A</w:t>
-      </w:r>
-      <w:r>
-        <w:rPr>
-          <w:sz w:val="28"/>
-          <w:szCs w:val="28"/>
-        </w:rPr>
-        <w:t xml:space="preserve"> (</w:t>
-      </w:r>
-      <w:r>
-        <w:rPr>
-          <w:sz w:val="28"/>
-          <w:szCs w:val="28"/>
-        </w:rPr>
-        <w:t>XA</w:t>
-      </w:r>
-      <w:r>
-        <w:rPr>
-          <w:sz w:val="28"/>
-          <w:szCs w:val="28"/>
-        </w:rPr>
-        <w:t xml:space="preserve"> = 3,</w:t>
-      </w:r>
-      <w:r>
-        <w:rPr>
-          <w:sz w:val="28"/>
-          <w:szCs w:val="28"/>
-        </w:rPr>
-        <w:t xml:space="preserve"> YA</w:t>
-      </w:r>
-      <w:r>
-        <w:rPr>
-          <w:sz w:val="28"/>
-          <w:szCs w:val="28"/>
-        </w:rPr>
-        <w:t xml:space="preserve"> = 16,</w:t>
-      </w:r>
-      <w:r>
-        <w:rPr>
-          <w:sz w:val="28"/>
-          <w:szCs w:val="28"/>
-        </w:rPr>
-        <w:t xml:space="preserve"> ZA </w:t>
-      </w:r>
-      <w:r>
-        <w:rPr>
-          <w:sz w:val="28"/>
-          <w:szCs w:val="28"/>
-        </w:rPr>
-        <w:t>= 10)</w:t>
-      </w:r>
-      <w:r>
-        <w:rPr>
-          <w:sz w:val="28"/>
-          <w:szCs w:val="28"/>
-        </w:rPr>
-        <w:t>, B</w:t>
-      </w:r>
-      <w:r>
-        <w:rPr>
-          <w:sz w:val="28"/>
-          <w:szCs w:val="28"/>
-        </w:rPr>
-        <w:t xml:space="preserve"> (</w:t>
-      </w:r>
-      <w:r>
-        <w:rPr>
-          <w:sz w:val="28"/>
-          <w:szCs w:val="28"/>
-        </w:rPr>
-        <w:t>XB</w:t>
-      </w:r>
-      <w:r>
-        <w:rPr>
-          <w:sz w:val="28"/>
-          <w:szCs w:val="28"/>
-        </w:rPr>
-        <w:t xml:space="preserve"> = 15,</w:t>
-      </w:r>
-      <w:r>
-        <w:rPr>
-          <w:sz w:val="28"/>
-          <w:szCs w:val="28"/>
-        </w:rPr>
-        <w:t xml:space="preserve"> YB</w:t>
-      </w:r>
-      <w:r>
-        <w:rPr>
-          <w:sz w:val="28"/>
-          <w:szCs w:val="28"/>
-        </w:rPr>
-        <w:t xml:space="preserve"> = 9,</w:t>
-      </w:r>
-      <w:r>
-        <w:rPr>
-          <w:sz w:val="28"/>
-          <w:szCs w:val="28"/>
-        </w:rPr>
-        <w:t xml:space="preserve"> ZB</w:t>
-      </w:r>
-      <w:r>
-        <w:rPr>
-          <w:sz w:val="28"/>
-          <w:szCs w:val="28"/>
-        </w:rPr>
-        <w:t xml:space="preserve"> = 16)</w:t>
-      </w:r>
-      <w:r>
-        <w:rPr>
-          <w:sz w:val="28"/>
-          <w:szCs w:val="28"/>
-        </w:rPr>
-        <w:t>, C</w:t>
-      </w:r>
-      <w:r>
-        <w:rPr>
-          <w:sz w:val="28"/>
-          <w:szCs w:val="28"/>
-        </w:rPr>
-        <w:t xml:space="preserve"> </w:t>
-      </w:r>
-      <w:r>
-        <w:rPr>
-          <w:sz w:val="28"/>
-          <w:szCs w:val="28"/>
-        </w:rPr>
-        <w:t>(</w:t>
-      </w:r>
-      <w:r>
-        <w:rPr>
-          <w:sz w:val="28"/>
-          <w:szCs w:val="28"/>
-        </w:rPr>
-        <w:t>XC</w:t>
-      </w:r>
-      <w:r>
-        <w:rPr>
-          <w:sz w:val="28"/>
-          <w:szCs w:val="28"/>
-        </w:rPr>
-        <w:t xml:space="preserve"> = 16,</w:t>
-      </w:r>
-      <w:r>
-        <w:rPr>
-          <w:sz w:val="28"/>
-          <w:szCs w:val="28"/>
-        </w:rPr>
-        <w:t xml:space="preserve"> YC</w:t>
-      </w:r>
-      <w:r>
-        <w:rPr>
-          <w:sz w:val="28"/>
-          <w:szCs w:val="28"/>
-        </w:rPr>
-        <w:t xml:space="preserve"> = 17,</w:t>
-      </w:r>
-      <w:r>
-        <w:rPr>
-          <w:sz w:val="28"/>
-          <w:szCs w:val="28"/>
-        </w:rPr>
-        <w:t xml:space="preserve"> ZC</w:t>
-      </w:r>
-      <w:r>
-        <w:rPr>
-          <w:sz w:val="28"/>
-          <w:szCs w:val="28"/>
-        </w:rPr>
-        <w:t xml:space="preserve"> = 9)</w:t>
-      </w:r>
-      <w:r>
-        <w:rPr>
-          <w:sz w:val="28"/>
-          <w:szCs w:val="28"/>
-        </w:rPr>
-        <w:t>, M</w:t>
-      </w:r>
-      <w:r>
-        <w:rPr>
-          <w:sz w:val="28"/>
-          <w:szCs w:val="28"/>
-        </w:rPr>
-        <w:t xml:space="preserve"> (</w:t>
-      </w:r>
-      <w:r>
-        <w:rPr>
-          <w:sz w:val="28"/>
-          <w:szCs w:val="28"/>
-        </w:rPr>
-        <w:t>XM</w:t>
-      </w:r>
-      <w:r>
-        <w:rPr>
-          <w:sz w:val="28"/>
-          <w:szCs w:val="28"/>
-        </w:rPr>
-        <w:t xml:space="preserve"> = 4,</w:t>
-      </w:r>
-      <w:r>
-        <w:rPr>
-          <w:sz w:val="28"/>
-          <w:szCs w:val="28"/>
-        </w:rPr>
-        <w:t xml:space="preserve"> YM</w:t>
-      </w:r>
-      <w:r>
-        <w:rPr>
-          <w:sz w:val="28"/>
-          <w:szCs w:val="28"/>
-        </w:rPr>
-        <w:t xml:space="preserve"> = 4,</w:t>
-      </w:r>
-      <w:r>
-        <w:rPr>
-          <w:sz w:val="28"/>
-          <w:szCs w:val="28"/>
-        </w:rPr>
-        <w:t xml:space="preserve"> ZM</w:t>
-      </w:r>
-      <w:r>
-        <w:rPr>
-          <w:sz w:val="28"/>
-          <w:szCs w:val="28"/>
-        </w:rPr>
-        <w:t xml:space="preserve"> = 8)</w:t>
-      </w:r>
-      <w:r>
-        <w:rPr>
-          <w:sz w:val="28"/>
-          <w:szCs w:val="28"/>
-        </w:rPr>
-        <w:t>, N</w:t>
-      </w:r>
-      <w:r>
-        <w:rPr>
-          <w:sz w:val="28"/>
-          <w:szCs w:val="28"/>
-        </w:rPr>
-        <w:t xml:space="preserve"> (</w:t>
-      </w:r>
-      <w:r>
-        <w:rPr>
-          <w:sz w:val="28"/>
-          <w:szCs w:val="28"/>
-        </w:rPr>
-        <w:t>XN</w:t>
-      </w:r>
-      <w:r>
-        <w:rPr>
-          <w:sz w:val="28"/>
-          <w:szCs w:val="28"/>
-        </w:rPr>
-        <w:t xml:space="preserve"> = 6,</w:t>
-      </w:r>
-      <w:r>
-        <w:rPr>
-          <w:sz w:val="28"/>
-          <w:szCs w:val="28"/>
-        </w:rPr>
-        <w:t xml:space="preserve"> YN</w:t>
-      </w:r>
-      <w:r>
-        <w:rPr>
-          <w:sz w:val="28"/>
-          <w:szCs w:val="28"/>
-        </w:rPr>
-        <w:t xml:space="preserve"> = 0,</w:t>
-      </w:r>
-      <w:r>
-        <w:rPr>
-          <w:sz w:val="28"/>
-          <w:szCs w:val="28"/>
-        </w:rPr>
-        <w:t xml:space="preserve"> ZN</w:t>
-      </w:r>
-      <w:r>
-        <w:rPr>
-          <w:sz w:val="28"/>
-          <w:szCs w:val="28"/>
-        </w:rPr>
-        <w:t xml:space="preserve"> = 18)</w:t>
-      </w:r>
-      <w:r>
-        <w:rPr>
-          <w:sz w:val="28"/>
-          <w:szCs w:val="28"/>
-        </w:rPr>
-        <w:t>, P</w:t>
-      </w:r>
-      <w:r>
-        <w:rPr>
-          <w:sz w:val="28"/>
-          <w:szCs w:val="28"/>
-        </w:rPr>
-        <w:t>(</w:t>
-      </w:r>
-      <w:r>
-        <w:rPr>
-          <w:sz w:val="28"/>
-          <w:szCs w:val="28"/>
-        </w:rPr>
-        <w:t>XP</w:t>
-      </w:r>
-      <w:r>
-        <w:rPr>
-          <w:sz w:val="28"/>
-          <w:szCs w:val="28"/>
-        </w:rPr>
-        <w:t xml:space="preserve"> = 14,</w:t>
-      </w:r>
-      <w:r>
-        <w:rPr>
-          <w:sz w:val="28"/>
-          <w:szCs w:val="28"/>
-        </w:rPr>
-        <w:t xml:space="preserve"> YP</w:t>
-      </w:r>
-      <w:r>
-        <w:rPr>
-          <w:sz w:val="28"/>
-          <w:szCs w:val="28"/>
-        </w:rPr>
-        <w:t xml:space="preserve"> = 0,</w:t>
-      </w:r>
-      <w:r>
-        <w:rPr>
-          <w:sz w:val="28"/>
-          <w:szCs w:val="28"/>
-        </w:rPr>
-        <w:t xml:space="preserve"> ZP</w:t>
-      </w:r>
-      <w:r>
-        <w:rPr>
-          <w:sz w:val="28"/>
-          <w:szCs w:val="28"/>
-        </w:rPr>
-        <w:t xml:space="preserve"> = 4)</w:t>
-      </w:r>
-      <w:r>
-        <w:rPr>
-          <w:sz w:val="28"/>
-          <w:szCs w:val="28"/>
-        </w:rPr>
-        <w:t>. Построить в декартовой системе координат треугольник ABC, прямую NM и точку P разными цветами</w:t>
+        <w:t xml:space="preserve">Для выполнения данного задания </w:t>
+      </w:r>
+      <w:r>
+        <w:rPr>
+          <w:sz w:val="28"/>
+          <w:szCs w:val="28"/>
+        </w:rPr>
+        <w:t>были построены треугольник, прямая и точка в пространстве.</w:t>
+      </w:r>
+    </w:p>
+    <w:p>
+      <w:pPr>
+        <w:spacing w:line="360" w:lineRule="auto"/>
+        <w:jc w:val="center"/>
+        <w:rPr>
+          <w:sz w:val="28"/>
+          <w:szCs w:val="28"/>
+        </w:rPr>
+      </w:pPr>
+      <w:r>
+        <w:rPr>
+          <w:sz w:val="28"/>
+          <w:szCs w:val="28"/>
+        </w:rPr>
+        <w:drawing>
+          <wp:inline distT="0" distB="0" distL="0" distR="0" wp14:anchorId="3AA7E772" wp14:editId="4558AFA5">
+            <wp:extent cx="3888683" cy="2777572"/>
+            <wp:effectExtent l="0" t="0" r="0" b="0"/>
+            <wp:docPr id="9" name="Рисунок 9"/>
+            <wp:cNvGraphicFramePr>
+              <a:graphicFrameLocks xmlns:a="http://schemas.openxmlformats.org/drawingml/2006/main" noChangeAspect="1"/>
+            </wp:cNvGraphicFramePr>
+            <a:graphic xmlns:a="http://schemas.openxmlformats.org/drawingml/2006/main">
+              <a:graphicData uri="http://schemas.openxmlformats.org/drawingml/2006/picture">
+                <pic:pic xmlns:pic="http://schemas.openxmlformats.org/drawingml/2006/picture">
+                  <pic:nvPicPr>
+                    <pic:cNvPr id="1" name=""/>
+                    <pic:cNvPicPr/>
+                  </pic:nvPicPr>
+                  <pic:blipFill>
+                    <a:blip r:embed="rId12"/>
+                    <a:stretch>
+                      <a:fillRect/>
+                    </a:stretch>
+                  </pic:blipFill>
+                  <pic:spPr>
+                    <a:xfrm>
+                      <a:off x="0" y="0"/>
+                      <a:ext cx="3914428" cy="2795961"/>
+                    </a:xfrm>
+                    <a:prstGeom prst="rect">
+                      <a:avLst/>
+                    </a:prstGeom>
+                  </pic:spPr>
+                </pic:pic>
+              </a:graphicData>
+            </a:graphic>
+          </wp:inline>
+        </w:drawing>
+      </w:r>
+    </w:p>
+    <w:p>
+      <w:pPr>
+        <w:spacing w:line="360" w:lineRule="auto"/>
+        <w:jc w:val="center"/>
+        <w:rPr>
+          <w:sz w:val="28"/>
+          <w:szCs w:val="28"/>
+        </w:rPr>
+      </w:pPr>
+      <w:r>
+        <w:rPr>
+          <w:sz w:val="28"/>
+          <w:szCs w:val="28"/>
+        </w:rPr>
+        <w:t xml:space="preserve">Рисунок </w:t>
+      </w:r>
+      <w:r>
+        <w:rPr>
+          <w:sz w:val="28"/>
+          <w:szCs w:val="28"/>
+        </w:rPr>
+        <w:t>7</w:t>
+      </w:r>
+      <w:r>
+        <w:rPr>
+          <w:sz w:val="28"/>
+          <w:szCs w:val="28"/>
+        </w:rPr>
+        <w:t xml:space="preserve">. Выполнение </w:t>
+      </w:r>
+      <w:r>
+        <w:rPr>
+          <w:sz w:val="28"/>
+          <w:szCs w:val="28"/>
+        </w:rPr>
+        <w:t>задания 2</w:t>
+      </w:r>
+      <w:r>
+        <w:rPr>
+          <w:sz w:val="28"/>
+          <w:szCs w:val="28"/>
+        </w:rPr>
+        <w:t xml:space="preserve">. Часть </w:t>
+      </w:r>
+      <w:r>
+        <w:rPr>
+          <w:sz w:val="28"/>
+          <w:szCs w:val="28"/>
+        </w:rPr>
+        <w:t>1</w:t>
       </w:r>
       <w:r>
         <w:rPr>
@@ -1651,7 +2472,113 @@
           <w:sz w:val="28"/>
           <w:szCs w:val="28"/>
         </w:rPr>
-        <w:t>ВЫПОЛНЕНИЕ РАБОТЫ:</w:t>
+        <w:lastRenderedPageBreak/>
+        <w:drawing>
+          <wp:inline distT="0" distB="0" distL="0" distR="0" wp14:anchorId="1A8C19BB" wp14:editId="6610505C">
+            <wp:extent cx="3553908" cy="3466532"/>
+            <wp:effectExtent l="0" t="0" r="0" b="0"/>
+            <wp:docPr id="10" name="Рисунок 10"/>
+            <wp:cNvGraphicFramePr>
+              <a:graphicFrameLocks xmlns:a="http://schemas.openxmlformats.org/drawingml/2006/main" noChangeAspect="1"/>
+            </wp:cNvGraphicFramePr>
+            <a:graphic xmlns:a="http://schemas.openxmlformats.org/drawingml/2006/main">
+              <a:graphicData uri="http://schemas.openxmlformats.org/drawingml/2006/picture">
+                <pic:pic xmlns:pic="http://schemas.openxmlformats.org/drawingml/2006/picture">
+                  <pic:nvPicPr>
+                    <pic:cNvPr id="1" name=""/>
+                    <pic:cNvPicPr/>
+                  </pic:nvPicPr>
+                  <pic:blipFill>
+                    <a:blip r:embed="rId13"/>
+                    <a:stretch>
+                      <a:fillRect/>
+                    </a:stretch>
+                  </pic:blipFill>
+                  <pic:spPr>
+                    <a:xfrm>
+                      <a:off x="0" y="0"/>
+                      <a:ext cx="3575873" cy="3487957"/>
+                    </a:xfrm>
+                    <a:prstGeom prst="rect">
+                      <a:avLst/>
+                    </a:prstGeom>
+                  </pic:spPr>
+                </pic:pic>
+              </a:graphicData>
+            </a:graphic>
+          </wp:inline>
+        </w:drawing>
+      </w:r>
+    </w:p>
+    <w:p>
+      <w:pPr>
+        <w:spacing w:line="360" w:lineRule="auto"/>
+        <w:jc w:val="center"/>
+        <w:rPr>
+          <w:sz w:val="28"/>
+          <w:szCs w:val="28"/>
+        </w:rPr>
+      </w:pPr>
+      <w:r>
+        <w:rPr>
+          <w:sz w:val="28"/>
+          <w:szCs w:val="28"/>
+        </w:rPr>
+        <w:t xml:space="preserve">Рисунок </w:t>
+      </w:r>
+      <w:r>
+        <w:rPr>
+          <w:sz w:val="28"/>
+          <w:szCs w:val="28"/>
+        </w:rPr>
+        <w:t>8</w:t>
+      </w:r>
+      <w:r>
+        <w:rPr>
+          <w:sz w:val="28"/>
+          <w:szCs w:val="28"/>
+        </w:rPr>
+        <w:t xml:space="preserve">. Выполнение задания 2. Часть </w:t>
+      </w:r>
+      <w:r>
+        <w:rPr>
+          <w:sz w:val="28"/>
+          <w:szCs w:val="28"/>
+        </w:rPr>
+        <w:t>2</w:t>
+      </w:r>
+      <w:r>
+        <w:rPr>
+          <w:sz w:val="28"/>
+          <w:szCs w:val="28"/>
+        </w:rPr>
+        <w:t>.</w:t>
+      </w:r>
+    </w:p>
+    <w:p>
+      <w:pPr>
+        <w:spacing w:line="360" w:lineRule="auto"/>
+        <w:jc w:val="center"/>
+        <w:rPr>
+          <w:sz w:val="20"/>
+        </w:rPr>
+      </w:pPr>
+    </w:p>
+    <w:p>
+      <w:pPr>
+        <w:spacing w:line="360" w:lineRule="auto"/>
+        <w:jc w:val="center"/>
+        <w:rPr>
+          <w:sz w:val="28"/>
+          <w:szCs w:val="28"/>
+        </w:rPr>
+      </w:pPr>
+      <w:r>
+        <w:rPr>
+          <w:sz w:val="28"/>
+          <w:szCs w:val="28"/>
+        </w:rPr>
+        <w:t>ЗАДАНИЕ 3 (вариант 14).</w:t>
       </w:r>
     </w:p>
     <w:p>
@@ -1669,7 +2596,24 @@
           <w:sz w:val="28"/>
           <w:szCs w:val="28"/>
         </w:rPr>
-        <w:t>Для выполнения данного задания было выполнено несколько примеров, которые продемонстрированы в методическом указании.</w:t>
+        <w:t>Построить плоскость, которой принадлежит треугольник ABC.</w:t>
+      </w:r>
+    </w:p>
+    <w:p>
+      <w:pPr>
+        <w:spacing w:line="360" w:lineRule="auto"/>
+        <w:jc w:val="center"/>
+        <w:rPr>
+          <w:sz w:val="28"/>
+          <w:szCs w:val="28"/>
+        </w:rPr>
+      </w:pPr>
+      <w:r>
+        <w:rPr>
+          <w:sz w:val="28"/>
+          <w:szCs w:val="28"/>
+        </w:rPr>
+        <w:t>ВЫПОЛНЕНИЕ РАБОТЫ:</w:t>
       </w:r>
     </w:p>
     <w:p>
@@ -1682,22 +2626,157 @@
           <w:szCs w:val="28"/>
         </w:rPr>
       </w:pPr>
-    </w:p>
-    <w:p>
-      <w:pPr>
-        <w:spacing w:line="360" w:lineRule="auto"/>
-        <w:jc w:val="center"/>
-        <w:rPr>
-          <w:sz w:val="28"/>
-          <w:szCs w:val="28"/>
-        </w:rPr>
-      </w:pPr>
-      <w:r>
-        <w:rPr>
-          <w:sz w:val="28"/>
-          <w:szCs w:val="28"/>
-        </w:rPr>
-        <w:t>ЗАДАНИЕ 3 (вариант 14).</w:t>
+      <w:r>
+        <w:rPr>
+          <w:sz w:val="28"/>
+          <w:szCs w:val="28"/>
+        </w:rPr>
+        <w:t xml:space="preserve">В ходе выполнения данного задания была построена плоскость по </w:t>
+      </w:r>
+      <w:proofErr w:type="spellStart"/>
+      <w:r>
+        <w:rPr>
+          <w:sz w:val="28"/>
+          <w:szCs w:val="28"/>
+        </w:rPr>
+        <w:t>трем</w:t>
+      </w:r>
+      <w:proofErr w:type="spellEnd"/>
+      <w:r>
+        <w:rPr>
+          <w:sz w:val="28"/>
+          <w:szCs w:val="28"/>
+        </w:rPr>
+        <w:t xml:space="preserve"> точкам, образующим треугольник </w:t>
+      </w:r>
+      <w:r>
+        <w:rPr>
+          <w:sz w:val="28"/>
+          <w:szCs w:val="28"/>
+          <w:lang w:val="en-US"/>
+        </w:rPr>
+        <w:t>ABC</w:t>
+      </w:r>
+      <w:r>
+        <w:rPr>
+          <w:sz w:val="28"/>
+          <w:szCs w:val="28"/>
+        </w:rPr>
+        <w:t>.</w:t>
+      </w:r>
+    </w:p>
+    <w:p>
+      <w:pPr>
+        <w:spacing w:line="360" w:lineRule="auto"/>
+        <w:jc w:val="center"/>
+        <w:rPr>
+          <w:sz w:val="28"/>
+          <w:szCs w:val="28"/>
+        </w:rPr>
+      </w:pPr>
+      <w:r>
+        <w:rPr>
+          <w:sz w:val="28"/>
+          <w:szCs w:val="28"/>
+        </w:rPr>
+        <w:drawing>
+          <wp:inline distT="0" distB="0" distL="0" distR="0" wp14:anchorId="5AC2CEB8" wp14:editId="7748C69D">
+            <wp:extent cx="3063923" cy="3262071"/>
+            <wp:effectExtent l="0" t="0" r="0" b="0"/>
+            <wp:docPr id="11" name="Рисунок 11"/>
+            <wp:cNvGraphicFramePr>
+              <a:graphicFrameLocks xmlns:a="http://schemas.openxmlformats.org/drawingml/2006/main" noChangeAspect="1"/>
+            </wp:cNvGraphicFramePr>
+            <a:graphic xmlns:a="http://schemas.openxmlformats.org/drawingml/2006/main">
+              <a:graphicData uri="http://schemas.openxmlformats.org/drawingml/2006/picture">
+                <pic:pic xmlns:pic="http://schemas.openxmlformats.org/drawingml/2006/picture">
+                  <pic:nvPicPr>
+                    <pic:cNvPr id="1" name=""/>
+                    <pic:cNvPicPr/>
+                  </pic:nvPicPr>
+                  <pic:blipFill>
+                    <a:blip r:embed="rId14"/>
+                    <a:stretch>
+                      <a:fillRect/>
+                    </a:stretch>
+                  </pic:blipFill>
+                  <pic:spPr>
+                    <a:xfrm>
+                      <a:off x="0" y="0"/>
+                      <a:ext cx="3099934" cy="3300411"/>
+                    </a:xfrm>
+                    <a:prstGeom prst="rect">
+                      <a:avLst/>
+                    </a:prstGeom>
+                  </pic:spPr>
+                </pic:pic>
+              </a:graphicData>
+            </a:graphic>
+          </wp:inline>
+        </w:drawing>
+      </w:r>
+    </w:p>
+    <w:p>
+      <w:pPr>
+        <w:spacing w:line="360" w:lineRule="auto"/>
+        <w:jc w:val="center"/>
+        <w:rPr>
+          <w:sz w:val="28"/>
+          <w:szCs w:val="28"/>
+        </w:rPr>
+      </w:pPr>
+      <w:r>
+        <w:rPr>
+          <w:sz w:val="28"/>
+          <w:szCs w:val="28"/>
+        </w:rPr>
+        <w:t xml:space="preserve">Рисунок </w:t>
+      </w:r>
+      <w:r>
+        <w:rPr>
+          <w:sz w:val="28"/>
+          <w:szCs w:val="28"/>
+        </w:rPr>
+        <w:t>9</w:t>
+      </w:r>
+      <w:r>
+        <w:rPr>
+          <w:sz w:val="28"/>
+          <w:szCs w:val="28"/>
+        </w:rPr>
+        <w:t xml:space="preserve">. Выполнение задания </w:t>
+      </w:r>
+      <w:r>
+        <w:rPr>
+          <w:sz w:val="28"/>
+          <w:szCs w:val="28"/>
+        </w:rPr>
+        <w:t>3</w:t>
+      </w:r>
+      <w:r>
+        <w:rPr>
+          <w:sz w:val="28"/>
+          <w:szCs w:val="28"/>
+        </w:rPr>
+        <w:t>.</w:t>
+      </w:r>
+    </w:p>
+    <w:p>
+      <w:pPr>
+        <w:spacing w:line="360" w:lineRule="auto"/>
+        <w:jc w:val="center"/>
+        <w:rPr>
+          <w:sz w:val="28"/>
+          <w:szCs w:val="28"/>
+        </w:rPr>
+      </w:pPr>
+      <w:r>
+        <w:rPr>
+          <w:sz w:val="28"/>
+          <w:szCs w:val="28"/>
+        </w:rPr>
+        <w:lastRenderedPageBreak/>
+        <w:t>ЗАДАНИЕ 4 (вариант 14).</w:t>
       </w:r>
     </w:p>
     <w:p>
@@ -1715,8 +2794,7 @@
           <w:sz w:val="28"/>
           <w:szCs w:val="28"/>
         </w:rPr>
-        <w:lastRenderedPageBreak/>
-        <w:t>Построить плоскость, которой принадлежит треугольник ABC.</w:t>
+        <w:t xml:space="preserve">Построить точку пересечения плоскости ABC и прямой NM. </w:t>
       </w:r>
     </w:p>
     <w:p>
@@ -1751,7 +2829,147 @@
           <w:sz w:val="28"/>
           <w:szCs w:val="28"/>
         </w:rPr>
-        <w:t>Была построена плоскость по трем точкам</w:t>
+        <w:t xml:space="preserve">Для выполнения данного задания </w:t>
+      </w:r>
+      <w:r>
+        <w:rPr>
+          <w:sz w:val="28"/>
+          <w:szCs w:val="28"/>
+        </w:rPr>
+        <w:t xml:space="preserve">балы найдена и построена точка пересечения плоскости </w:t>
+      </w:r>
+      <w:r>
+        <w:rPr>
+          <w:sz w:val="28"/>
+          <w:szCs w:val="28"/>
+          <w:lang w:val="en-US"/>
+        </w:rPr>
+        <w:t>ABC</w:t>
+      </w:r>
+      <w:r>
+        <w:rPr>
+          <w:sz w:val="28"/>
+          <w:szCs w:val="28"/>
+        </w:rPr>
+        <w:t xml:space="preserve">, созданной в предыдущем задании, </w:t>
+      </w:r>
+      <w:r>
+        <w:rPr>
+          <w:sz w:val="28"/>
+          <w:szCs w:val="28"/>
+        </w:rPr>
+        <w:t xml:space="preserve">и прямой </w:t>
+      </w:r>
+      <w:r>
+        <w:rPr>
+          <w:sz w:val="28"/>
+          <w:szCs w:val="28"/>
+          <w:lang w:val="en-US"/>
+        </w:rPr>
+        <w:t>MN</w:t>
+      </w:r>
+      <w:r>
+        <w:rPr>
+          <w:sz w:val="28"/>
+          <w:szCs w:val="28"/>
+        </w:rPr>
+        <w:t>.</w:t>
+      </w:r>
+    </w:p>
+    <w:p>
+      <w:pPr>
+        <w:spacing w:line="360" w:lineRule="auto"/>
+        <w:jc w:val="center"/>
+        <w:rPr>
+          <w:sz w:val="28"/>
+          <w:szCs w:val="28"/>
+        </w:rPr>
+      </w:pPr>
+      <w:r>
+        <w:rPr>
+          <w:sz w:val="28"/>
+          <w:szCs w:val="28"/>
+        </w:rPr>
+        <w:drawing>
+          <wp:inline distT="0" distB="0" distL="0" distR="0" wp14:anchorId="4F6604A3" wp14:editId="65BE4A26">
+            <wp:extent cx="3473356" cy="4863815"/>
+            <wp:effectExtent l="0" t="0" r="0" b="0"/>
+            <wp:docPr id="12" name="Рисунок 12"/>
+            <wp:cNvGraphicFramePr>
+              <a:graphicFrameLocks xmlns:a="http://schemas.openxmlformats.org/drawingml/2006/main" noChangeAspect="1"/>
+            </wp:cNvGraphicFramePr>
+            <a:graphic xmlns:a="http://schemas.openxmlformats.org/drawingml/2006/main">
+              <a:graphicData uri="http://schemas.openxmlformats.org/drawingml/2006/picture">
+                <pic:pic xmlns:pic="http://schemas.openxmlformats.org/drawingml/2006/picture">
+                  <pic:nvPicPr>
+                    <pic:cNvPr id="1" name=""/>
+                    <pic:cNvPicPr/>
+                  </pic:nvPicPr>
+                  <pic:blipFill>
+                    <a:blip r:embed="rId15"/>
+                    <a:stretch>
+                      <a:fillRect/>
+                    </a:stretch>
+                  </pic:blipFill>
+                  <pic:spPr>
+                    <a:xfrm>
+                      <a:off x="0" y="0"/>
+                      <a:ext cx="3526898" cy="4938791"/>
+                    </a:xfrm>
+                    <a:prstGeom prst="rect">
+                      <a:avLst/>
+                    </a:prstGeom>
+                  </pic:spPr>
+                </pic:pic>
+              </a:graphicData>
+            </a:graphic>
+          </wp:inline>
+        </w:drawing>
+      </w:r>
+    </w:p>
+    <w:p>
+      <w:pPr>
+        <w:spacing w:line="360" w:lineRule="auto"/>
+        <w:jc w:val="center"/>
+        <w:rPr>
+          <w:sz w:val="28"/>
+          <w:szCs w:val="28"/>
+        </w:rPr>
+      </w:pPr>
+      <w:r>
+        <w:rPr>
+          <w:sz w:val="28"/>
+          <w:szCs w:val="28"/>
+        </w:rPr>
+        <w:t xml:space="preserve">Рисунок </w:t>
+      </w:r>
+      <w:r>
+        <w:rPr>
+          <w:sz w:val="28"/>
+          <w:szCs w:val="28"/>
+        </w:rPr>
+        <w:t>10</w:t>
+      </w:r>
+      <w:r>
+        <w:rPr>
+          <w:sz w:val="28"/>
+          <w:szCs w:val="28"/>
+        </w:rPr>
+        <w:t xml:space="preserve">. Выполнение задания </w:t>
+      </w:r>
+      <w:r>
+        <w:rPr>
+          <w:sz w:val="28"/>
+          <w:szCs w:val="28"/>
+        </w:rPr>
+        <w:t>4</w:t>
+      </w:r>
+      <w:r>
+        <w:rPr>
+          <w:sz w:val="28"/>
+          <w:szCs w:val="28"/>
+        </w:rPr>
+        <w:t>.</w:t>
       </w:r>
     </w:p>
     <w:p>
@@ -1779,7 +2997,7 @@
           <w:sz w:val="28"/>
           <w:szCs w:val="28"/>
         </w:rPr>
-        <w:t>ЗАДАНИЕ 4 (вариант 14).</w:t>
+        <w:t>ЗАДАНИЕ 5 (вариант 14).</w:t>
       </w:r>
     </w:p>
     <w:p>
@@ -1797,7 +3015,7 @@
           <w:sz w:val="28"/>
           <w:szCs w:val="28"/>
         </w:rPr>
-        <w:t xml:space="preserve">Построить точку пересечения плоскости ABC и прямой NM. </w:t>
+        <w:t>Построить прямую, проходящую через точку P и параллельную плоскости треугольника ABC.</w:t>
       </w:r>
     </w:p>
     <w:p>
@@ -1832,7 +3050,168 @@
           <w:sz w:val="28"/>
           <w:szCs w:val="28"/>
         </w:rPr>
-        <w:t>Для выполнения данного задания было выполнено несколько примеров, которые продемонстрированы в методическом указании.</w:t>
+        <w:t xml:space="preserve">Для выполнения данного задания </w:t>
+      </w:r>
+      <w:r>
+        <w:rPr>
+          <w:sz w:val="28"/>
+          <w:szCs w:val="28"/>
+        </w:rPr>
+        <w:t xml:space="preserve">была построена прямая, проходящая через точку </w:t>
+      </w:r>
+      <w:r>
+        <w:rPr>
+          <w:sz w:val="28"/>
+          <w:szCs w:val="28"/>
+          <w:lang w:val="en-US"/>
+        </w:rPr>
+        <w:t xml:space="preserve">P </w:t>
+      </w:r>
+      <w:r>
+        <w:rPr>
+          <w:sz w:val="28"/>
+          <w:szCs w:val="28"/>
+        </w:rPr>
+        <w:t xml:space="preserve">и параллельная плоскости треугольника </w:t>
+      </w:r>
+      <w:r>
+        <w:rPr>
+          <w:sz w:val="28"/>
+          <w:szCs w:val="28"/>
+          <w:lang w:val="en-US"/>
+        </w:rPr>
+        <w:t>ABC.</w:t>
+      </w:r>
+    </w:p>
+    <w:p>
+      <w:pPr>
+        <w:spacing w:line="360" w:lineRule="auto"/>
+        <w:jc w:val="center"/>
+        <w:rPr>
+          <w:sz w:val="28"/>
+          <w:szCs w:val="28"/>
+        </w:rPr>
+      </w:pPr>
+      <w:r>
+        <w:rPr>
+          <w:sz w:val="28"/>
+          <w:szCs w:val="28"/>
+        </w:rPr>
+        <w:lastRenderedPageBreak/>
+        <w:drawing>
+          <wp:inline distT="0" distB="0" distL="0" distR="0" wp14:anchorId="442AB3B6" wp14:editId="71823619">
+            <wp:extent cx="3501180" cy="3787254"/>
+            <wp:effectExtent l="0" t="0" r="0" b="0"/>
+            <wp:docPr id="13" name="Рисунок 13"/>
+            <wp:cNvGraphicFramePr>
+              <a:graphicFrameLocks xmlns:a="http://schemas.openxmlformats.org/drawingml/2006/main" noChangeAspect="1"/>
+            </wp:cNvGraphicFramePr>
+            <a:graphic xmlns:a="http://schemas.openxmlformats.org/drawingml/2006/main">
+              <a:graphicData uri="http://schemas.openxmlformats.org/drawingml/2006/picture">
+                <pic:pic xmlns:pic="http://schemas.openxmlformats.org/drawingml/2006/picture">
+                  <pic:nvPicPr>
+                    <pic:cNvPr id="1" name=""/>
+                    <pic:cNvPicPr/>
+                  </pic:nvPicPr>
+                  <pic:blipFill rotWithShape="1">
+                    <a:blip r:embed="rId16"/>
+                    <a:srcRect t="2020"/>
+                    <a:stretch/>
+                  </pic:blipFill>
+                  <pic:spPr bwMode="auto">
+                    <a:xfrm>
+                      <a:off x="0" y="0"/>
+                      <a:ext cx="3526487" cy="3814629"/>
+                    </a:xfrm>
+                    <a:prstGeom prst="rect">
+                      <a:avLst/>
+                    </a:prstGeom>
+                    <a:ln>
+                      <a:noFill/>
+                    </a:ln>
+                    <a:extLst>
+                      <a:ext uri="{53640926-AAD7-44D8-BBD7-CCE9431645EC}">
+                        <a14:shadowObscured xmlns:a14="http://schemas.microsoft.com/office/drawing/2010/main"/>
+                      </a:ext>
+                    </a:extLst>
+                  </pic:spPr>
+                </pic:pic>
+              </a:graphicData>
+            </a:graphic>
+          </wp:inline>
+        </w:drawing>
+      </w:r>
+    </w:p>
+    <w:p>
+      <w:pPr>
+        <w:spacing w:line="360" w:lineRule="auto"/>
+        <w:jc w:val="center"/>
+        <w:rPr>
+          <w:sz w:val="28"/>
+          <w:szCs w:val="28"/>
+        </w:rPr>
+      </w:pPr>
+      <w:r>
+        <w:rPr>
+          <w:sz w:val="28"/>
+          <w:szCs w:val="28"/>
+        </w:rPr>
+        <w:t>Рисунок 1</w:t>
+      </w:r>
+      <w:r>
+        <w:rPr>
+          <w:sz w:val="28"/>
+          <w:szCs w:val="28"/>
+        </w:rPr>
+        <w:t>1</w:t>
+      </w:r>
+      <w:r>
+        <w:rPr>
+          <w:sz w:val="28"/>
+          <w:szCs w:val="28"/>
+        </w:rPr>
+        <w:t xml:space="preserve">. Выполнение задания </w:t>
+      </w:r>
+      <w:r>
+        <w:rPr>
+          <w:sz w:val="28"/>
+          <w:szCs w:val="28"/>
+        </w:rPr>
+        <w:t>5</w:t>
+      </w:r>
+      <w:r>
+        <w:rPr>
+          <w:sz w:val="28"/>
+          <w:szCs w:val="28"/>
+        </w:rPr>
+        <w:t>.</w:t>
+      </w:r>
+    </w:p>
+    <w:p>
+      <w:pPr>
+        <w:spacing w:line="360" w:lineRule="auto"/>
+        <w:jc w:val="center"/>
+        <w:rPr>
+          <w:sz w:val="28"/>
+          <w:szCs w:val="28"/>
+        </w:rPr>
+      </w:pPr>
+    </w:p>
+    <w:p>
+      <w:pPr>
+        <w:spacing w:line="360" w:lineRule="auto"/>
+        <w:jc w:val="center"/>
+        <w:rPr>
+          <w:sz w:val="28"/>
+          <w:szCs w:val="28"/>
+        </w:rPr>
+      </w:pPr>
+      <w:r>
+        <w:rPr>
+          <w:sz w:val="28"/>
+          <w:szCs w:val="28"/>
+        </w:rPr>
+        <w:t>ЗАДАНИЕ 6 (вариант 14).</w:t>
       </w:r>
     </w:p>
     <w:p>
@@ -1845,22 +3224,29 @@
           <w:szCs w:val="28"/>
         </w:rPr>
       </w:pPr>
-    </w:p>
-    <w:p>
-      <w:pPr>
-        <w:spacing w:line="360" w:lineRule="auto"/>
-        <w:jc w:val="center"/>
-        <w:rPr>
-          <w:sz w:val="28"/>
-          <w:szCs w:val="28"/>
-        </w:rPr>
-      </w:pPr>
-      <w:r>
-        <w:rPr>
-          <w:sz w:val="28"/>
-          <w:szCs w:val="28"/>
-        </w:rPr>
-        <w:t>ЗАДАНИЕ 5 (вариант 14).</w:t>
+      <w:r>
+        <w:rPr>
+          <w:sz w:val="28"/>
+          <w:szCs w:val="28"/>
+        </w:rPr>
+        <w:t>Построить точку P′, являющуюся зеркальным отражением точки P относительно плоскости, заданной треугольником ABC.</w:t>
+      </w:r>
+    </w:p>
+    <w:p>
+      <w:pPr>
+        <w:spacing w:line="360" w:lineRule="auto"/>
+        <w:jc w:val="center"/>
+        <w:rPr>
+          <w:sz w:val="28"/>
+          <w:szCs w:val="28"/>
+        </w:rPr>
+      </w:pPr>
+      <w:r>
+        <w:rPr>
+          <w:sz w:val="28"/>
+          <w:szCs w:val="28"/>
+        </w:rPr>
+        <w:t>ВЫПОЛНЕНИЕ РАБОТЫ:</w:t>
       </w:r>
     </w:p>
     <w:p>
@@ -1878,24 +3264,279 @@
           <w:sz w:val="28"/>
           <w:szCs w:val="28"/>
         </w:rPr>
-        <w:t>Построить прямую, проходящую через точку P и параллельную плоскости треугольника ABC.</w:t>
-      </w:r>
-    </w:p>
-    <w:p>
-      <w:pPr>
-        <w:spacing w:line="360" w:lineRule="auto"/>
-        <w:jc w:val="center"/>
-        <w:rPr>
-          <w:sz w:val="28"/>
-          <w:szCs w:val="28"/>
-        </w:rPr>
-      </w:pPr>
-      <w:r>
-        <w:rPr>
-          <w:sz w:val="28"/>
-          <w:szCs w:val="28"/>
-        </w:rPr>
-        <w:t>ВЫПОЛНЕНИЕ РАБОТЫ:</w:t>
+        <w:t xml:space="preserve">Для выполнения данного задания </w:t>
+      </w:r>
+      <w:r>
+        <w:rPr>
+          <w:sz w:val="28"/>
+          <w:szCs w:val="28"/>
+        </w:rPr>
+        <w:t xml:space="preserve">была построена точка </w:t>
+      </w:r>
+      <w:r>
+        <w:rPr>
+          <w:sz w:val="28"/>
+          <w:szCs w:val="28"/>
+          <w:lang w:val="en-US"/>
+        </w:rPr>
+        <w:t xml:space="preserve">P’, </w:t>
+      </w:r>
+      <w:r>
+        <w:rPr>
+          <w:sz w:val="28"/>
+          <w:szCs w:val="28"/>
+        </w:rPr>
+        <w:t xml:space="preserve">которая является зеркальным отражением точки </w:t>
+      </w:r>
+      <w:r>
+        <w:rPr>
+          <w:sz w:val="28"/>
+          <w:szCs w:val="28"/>
+          <w:lang w:val="en-US"/>
+        </w:rPr>
+        <w:t xml:space="preserve">P </w:t>
+      </w:r>
+      <w:r>
+        <w:rPr>
+          <w:sz w:val="28"/>
+          <w:szCs w:val="28"/>
+        </w:rPr>
+        <w:t xml:space="preserve">относительно плоскости, заданной треугольником </w:t>
+      </w:r>
+      <w:r>
+        <w:rPr>
+          <w:sz w:val="28"/>
+          <w:szCs w:val="28"/>
+          <w:lang w:val="en-US"/>
+        </w:rPr>
+        <w:t>ABC</w:t>
+      </w:r>
+      <w:r>
+        <w:rPr>
+          <w:sz w:val="28"/>
+          <w:szCs w:val="28"/>
+        </w:rPr>
+        <w:t>.</w:t>
+      </w:r>
+    </w:p>
+    <w:p>
+      <w:pPr>
+        <w:spacing w:line="360" w:lineRule="auto"/>
+        <w:jc w:val="center"/>
+        <w:rPr>
+          <w:sz w:val="28"/>
+          <w:szCs w:val="28"/>
+        </w:rPr>
+      </w:pPr>
+      <w:r>
+        <w:rPr>
+          <w:sz w:val="28"/>
+          <w:szCs w:val="28"/>
+        </w:rPr>
+        <w:drawing>
+          <wp:inline distT="0" distB="0" distL="0" distR="0" wp14:anchorId="714B6E4E" wp14:editId="286B53BC">
+            <wp:extent cx="4264494" cy="2238233"/>
+            <wp:effectExtent l="0" t="0" r="0" b="0"/>
+            <wp:docPr id="15" name="Рисунок 15"/>
+            <wp:cNvGraphicFramePr>
+              <a:graphicFrameLocks xmlns:a="http://schemas.openxmlformats.org/drawingml/2006/main" noChangeAspect="1"/>
+            </wp:cNvGraphicFramePr>
+            <a:graphic xmlns:a="http://schemas.openxmlformats.org/drawingml/2006/main">
+              <a:graphicData uri="http://schemas.openxmlformats.org/drawingml/2006/picture">
+                <pic:pic xmlns:pic="http://schemas.openxmlformats.org/drawingml/2006/picture">
+                  <pic:nvPicPr>
+                    <pic:cNvPr id="1" name=""/>
+                    <pic:cNvPicPr/>
+                  </pic:nvPicPr>
+                  <pic:blipFill>
+                    <a:blip r:embed="rId17"/>
+                    <a:stretch>
+                      <a:fillRect/>
+                    </a:stretch>
+                  </pic:blipFill>
+                  <pic:spPr>
+                    <a:xfrm>
+                      <a:off x="0" y="0"/>
+                      <a:ext cx="4285308" cy="2249157"/>
+                    </a:xfrm>
+                    <a:prstGeom prst="rect">
+                      <a:avLst/>
+                    </a:prstGeom>
+                  </pic:spPr>
+                </pic:pic>
+              </a:graphicData>
+            </a:graphic>
+          </wp:inline>
+        </w:drawing>
+      </w:r>
+    </w:p>
+    <w:p>
+      <w:pPr>
+        <w:spacing w:line="360" w:lineRule="auto"/>
+        <w:jc w:val="center"/>
+        <w:rPr>
+          <w:sz w:val="28"/>
+          <w:szCs w:val="28"/>
+        </w:rPr>
+      </w:pPr>
+      <w:r>
+        <w:rPr>
+          <w:sz w:val="28"/>
+          <w:szCs w:val="28"/>
+        </w:rPr>
+        <w:t>Рисунок 1</w:t>
+      </w:r>
+      <w:r>
+        <w:rPr>
+          <w:sz w:val="28"/>
+          <w:szCs w:val="28"/>
+        </w:rPr>
+        <w:t>2</w:t>
+      </w:r>
+      <w:r>
+        <w:rPr>
+          <w:sz w:val="28"/>
+          <w:szCs w:val="28"/>
+        </w:rPr>
+        <w:t xml:space="preserve">. Выполнение задания </w:t>
+      </w:r>
+      <w:r>
+        <w:rPr>
+          <w:sz w:val="28"/>
+          <w:szCs w:val="28"/>
+        </w:rPr>
+        <w:t>6</w:t>
+      </w:r>
+      <w:r>
+        <w:rPr>
+          <w:sz w:val="28"/>
+          <w:szCs w:val="28"/>
+        </w:rPr>
+        <w:t>.</w:t>
+      </w:r>
+      <w:r>
+        <w:rPr>
+          <w:sz w:val="28"/>
+          <w:szCs w:val="28"/>
+        </w:rPr>
+        <w:t xml:space="preserve"> Часть 1.</w:t>
+      </w:r>
+    </w:p>
+    <w:p>
+      <w:pPr>
+        <w:spacing w:line="360" w:lineRule="auto"/>
+        <w:jc w:val="center"/>
+        <w:rPr>
+          <w:sz w:val="28"/>
+          <w:szCs w:val="28"/>
+        </w:rPr>
+      </w:pPr>
+      <w:r>
+        <w:rPr>
+          <w:sz w:val="28"/>
+          <w:szCs w:val="28"/>
+        </w:rPr>
+        <w:lastRenderedPageBreak/>
+        <w:drawing>
+          <wp:inline distT="0" distB="0" distL="0" distR="0" wp14:anchorId="5CE3AF68" wp14:editId="7531F709">
+            <wp:extent cx="4183039" cy="5515084"/>
+            <wp:effectExtent l="0" t="0" r="0" b="0"/>
+            <wp:docPr id="16" name="Рисунок 16"/>
+            <wp:cNvGraphicFramePr>
+              <a:graphicFrameLocks xmlns:a="http://schemas.openxmlformats.org/drawingml/2006/main" noChangeAspect="1"/>
+            </wp:cNvGraphicFramePr>
+            <a:graphic xmlns:a="http://schemas.openxmlformats.org/drawingml/2006/main">
+              <a:graphicData uri="http://schemas.openxmlformats.org/drawingml/2006/picture">
+                <pic:pic xmlns:pic="http://schemas.openxmlformats.org/drawingml/2006/picture">
+                  <pic:nvPicPr>
+                    <pic:cNvPr id="1" name=""/>
+                    <pic:cNvPicPr/>
+                  </pic:nvPicPr>
+                  <pic:blipFill>
+                    <a:blip r:embed="rId18"/>
+                    <a:stretch>
+                      <a:fillRect/>
+                    </a:stretch>
+                  </pic:blipFill>
+                  <pic:spPr>
+                    <a:xfrm>
+                      <a:off x="0" y="0"/>
+                      <a:ext cx="4196376" cy="5532668"/>
+                    </a:xfrm>
+                    <a:prstGeom prst="rect">
+                      <a:avLst/>
+                    </a:prstGeom>
+                  </pic:spPr>
+                </pic:pic>
+              </a:graphicData>
+            </a:graphic>
+          </wp:inline>
+        </w:drawing>
+      </w:r>
+    </w:p>
+    <w:p>
+      <w:pPr>
+        <w:spacing w:line="360" w:lineRule="auto"/>
+        <w:jc w:val="center"/>
+        <w:rPr>
+          <w:sz w:val="28"/>
+          <w:szCs w:val="28"/>
+        </w:rPr>
+      </w:pPr>
+      <w:r>
+        <w:rPr>
+          <w:sz w:val="28"/>
+          <w:szCs w:val="28"/>
+        </w:rPr>
+        <w:t>Рисунок 1</w:t>
+      </w:r>
+      <w:r>
+        <w:rPr>
+          <w:sz w:val="28"/>
+          <w:szCs w:val="28"/>
+        </w:rPr>
+        <w:t>3</w:t>
+      </w:r>
+      <w:r>
+        <w:rPr>
+          <w:sz w:val="28"/>
+          <w:szCs w:val="28"/>
+        </w:rPr>
+        <w:t>. Выполнение задания 6.</w:t>
+      </w:r>
+      <w:r>
+        <w:rPr>
+          <w:sz w:val="28"/>
+          <w:szCs w:val="28"/>
+        </w:rPr>
+        <w:t xml:space="preserve"> Часть 2.</w:t>
+      </w:r>
+    </w:p>
+    <w:p>
+      <w:pPr>
+        <w:spacing w:line="360" w:lineRule="auto"/>
+        <w:jc w:val="center"/>
+        <w:rPr>
+          <w:sz w:val="28"/>
+          <w:szCs w:val="28"/>
+        </w:rPr>
+      </w:pPr>
+    </w:p>
+    <w:p>
+      <w:pPr>
+        <w:spacing w:line="360" w:lineRule="auto"/>
+        <w:jc w:val="center"/>
+        <w:rPr>
+          <w:sz w:val="28"/>
+          <w:szCs w:val="28"/>
+        </w:rPr>
+      </w:pPr>
+      <w:r>
+        <w:rPr>
+          <w:sz w:val="28"/>
+          <w:szCs w:val="28"/>
+        </w:rPr>
+        <w:t>ЗАДАНИЕ 7 (вариант 14).</w:t>
       </w:r>
     </w:p>
     <w:p>
@@ -1905,15 +3546,30 @@
         <w:jc w:val="both"/>
         <w:rPr>
           <w:sz w:val="28"/>
-          <w:szCs w:val="28"/>
-        </w:rPr>
-      </w:pPr>
-      <w:r>
-        <w:rPr>
-          <w:sz w:val="28"/>
-          <w:szCs w:val="28"/>
-        </w:rPr>
-        <w:t>Для выполнения данного задания было выполнено несколько примеров, которые продемонстрированы в методическом указании.</w:t>
+        </w:rPr>
+      </w:pPr>
+      <w:r>
+        <w:rPr>
+          <w:sz w:val="28"/>
+        </w:rPr>
+        <w:t>Построить плоскость, параллельную плоскости, заданной треугольником ABC, и проходящую через точку P.</w:t>
+      </w:r>
+    </w:p>
+    <w:p>
+      <w:pPr>
+        <w:spacing w:line="360" w:lineRule="auto"/>
+        <w:jc w:val="center"/>
+        <w:rPr>
+          <w:sz w:val="28"/>
+          <w:szCs w:val="28"/>
+        </w:rPr>
+      </w:pPr>
+      <w:r>
+        <w:rPr>
+          <w:sz w:val="28"/>
+          <w:szCs w:val="28"/>
+        </w:rPr>
+        <w:t>ВЫПОЛНЕНИЕ РАБОТЫ:</w:t>
       </w:r>
     </w:p>
     <w:p>
@@ -1926,22 +3582,173 @@
           <w:szCs w:val="28"/>
         </w:rPr>
       </w:pPr>
-    </w:p>
-    <w:p>
-      <w:pPr>
-        <w:spacing w:line="360" w:lineRule="auto"/>
-        <w:jc w:val="center"/>
-        <w:rPr>
-          <w:sz w:val="28"/>
-          <w:szCs w:val="28"/>
-        </w:rPr>
-      </w:pPr>
-      <w:r>
-        <w:rPr>
-          <w:sz w:val="28"/>
-          <w:szCs w:val="28"/>
-        </w:rPr>
-        <w:t>ЗАДАНИЕ 6 (вариант 14).</w:t>
+      <w:r>
+        <w:rPr>
+          <w:sz w:val="28"/>
+          <w:szCs w:val="28"/>
+        </w:rPr>
+        <w:t>Для выполнения данного задания был</w:t>
+      </w:r>
+      <w:r>
+        <w:rPr>
+          <w:sz w:val="28"/>
+          <w:szCs w:val="28"/>
+        </w:rPr>
+        <w:t xml:space="preserve">а построена плоскость, которая параллельна плоскости, заданной треугольником </w:t>
+      </w:r>
+      <w:r>
+        <w:rPr>
+          <w:sz w:val="28"/>
+          <w:szCs w:val="28"/>
+          <w:lang w:val="en-US"/>
+        </w:rPr>
+        <w:t>ABC</w:t>
+      </w:r>
+      <w:r>
+        <w:rPr>
+          <w:sz w:val="28"/>
+          <w:szCs w:val="28"/>
+        </w:rPr>
+        <w:t xml:space="preserve">, и проходящей через точку </w:t>
+      </w:r>
+      <w:r>
+        <w:rPr>
+          <w:sz w:val="28"/>
+          <w:szCs w:val="28"/>
+          <w:lang w:val="en-US"/>
+        </w:rPr>
+        <w:t>P</w:t>
+      </w:r>
+      <w:r>
+        <w:rPr>
+          <w:sz w:val="28"/>
+          <w:szCs w:val="28"/>
+        </w:rPr>
+        <w:t>.</w:t>
+      </w:r>
+    </w:p>
+    <w:p>
+      <w:pPr>
+        <w:spacing w:line="360" w:lineRule="auto"/>
+        <w:jc w:val="center"/>
+        <w:rPr>
+          <w:sz w:val="28"/>
+          <w:szCs w:val="28"/>
+        </w:rPr>
+      </w:pPr>
+      <w:r>
+        <w:rPr>
+          <w:sz w:val="28"/>
+          <w:szCs w:val="28"/>
+        </w:rPr>
+        <w:lastRenderedPageBreak/>
+        <w:drawing>
+          <wp:inline distT="0" distB="0" distL="0" distR="0" wp14:anchorId="34EAD9C6" wp14:editId="18B42D62">
+            <wp:extent cx="3789977" cy="3930556"/>
+            <wp:effectExtent l="0" t="0" r="0" b="0"/>
+            <wp:docPr id="17" name="Рисунок 17"/>
+            <wp:cNvGraphicFramePr>
+              <a:graphicFrameLocks xmlns:a="http://schemas.openxmlformats.org/drawingml/2006/main" noChangeAspect="1"/>
+            </wp:cNvGraphicFramePr>
+            <a:graphic xmlns:a="http://schemas.openxmlformats.org/drawingml/2006/main">
+              <a:graphicData uri="http://schemas.openxmlformats.org/drawingml/2006/picture">
+                <pic:pic xmlns:pic="http://schemas.openxmlformats.org/drawingml/2006/picture">
+                  <pic:nvPicPr>
+                    <pic:cNvPr id="1" name=""/>
+                    <pic:cNvPicPr/>
+                  </pic:nvPicPr>
+                  <pic:blipFill>
+                    <a:blip r:embed="rId19"/>
+                    <a:stretch>
+                      <a:fillRect/>
+                    </a:stretch>
+                  </pic:blipFill>
+                  <pic:spPr>
+                    <a:xfrm>
+                      <a:off x="0" y="0"/>
+                      <a:ext cx="3800969" cy="3941956"/>
+                    </a:xfrm>
+                    <a:prstGeom prst="rect">
+                      <a:avLst/>
+                    </a:prstGeom>
+                  </pic:spPr>
+                </pic:pic>
+              </a:graphicData>
+            </a:graphic>
+          </wp:inline>
+        </w:drawing>
+      </w:r>
+    </w:p>
+    <w:p>
+      <w:pPr>
+        <w:spacing w:line="360" w:lineRule="auto"/>
+        <w:jc w:val="center"/>
+        <w:rPr>
+          <w:sz w:val="28"/>
+          <w:szCs w:val="28"/>
+        </w:rPr>
+      </w:pPr>
+      <w:r>
+        <w:rPr>
+          <w:sz w:val="28"/>
+          <w:szCs w:val="28"/>
+        </w:rPr>
+        <w:t>Рисунок 1</w:t>
+      </w:r>
+      <w:r>
+        <w:rPr>
+          <w:sz w:val="28"/>
+          <w:szCs w:val="28"/>
+        </w:rPr>
+        <w:t>4</w:t>
+      </w:r>
+      <w:r>
+        <w:rPr>
+          <w:sz w:val="28"/>
+          <w:szCs w:val="28"/>
+        </w:rPr>
+        <w:t xml:space="preserve">. Выполнение задания </w:t>
+      </w:r>
+      <w:r>
+        <w:rPr>
+          <w:sz w:val="28"/>
+          <w:szCs w:val="28"/>
+        </w:rPr>
+        <w:t>7</w:t>
+      </w:r>
+      <w:r>
+        <w:rPr>
+          <w:sz w:val="28"/>
+          <w:szCs w:val="28"/>
+        </w:rPr>
+        <w:t>.</w:t>
+      </w:r>
+    </w:p>
+    <w:p>
+      <w:pPr>
+        <w:spacing w:line="360" w:lineRule="auto"/>
+        <w:jc w:val="center"/>
+        <w:rPr>
+          <w:sz w:val="28"/>
+          <w:szCs w:val="28"/>
+        </w:rPr>
+      </w:pPr>
+    </w:p>
+    <w:p>
+      <w:pPr>
+        <w:spacing w:line="360" w:lineRule="auto"/>
+        <w:jc w:val="center"/>
+        <w:rPr>
+          <w:sz w:val="28"/>
+          <w:szCs w:val="28"/>
+        </w:rPr>
+      </w:pPr>
+      <w:r>
+        <w:rPr>
+          <w:sz w:val="28"/>
+          <w:szCs w:val="28"/>
+        </w:rPr>
+        <w:t>ЗАДАНИЕ 8 (вариант 14).</w:t>
       </w:r>
     </w:p>
     <w:p>
@@ -1959,7 +3766,7 @@
           <w:sz w:val="28"/>
           <w:szCs w:val="28"/>
         </w:rPr>
-        <w:t>Построить точку P′, являющуюся зеркальным отражением точки P относительно плоскости, заданной треугольником ABC. Вычислить длину отрезка PP′</w:t>
+        <w:t>Построить плоскость, перпендикулярную плоскости, заданной треугольником ABC, и проходящую через точку P.</w:t>
       </w:r>
     </w:p>
     <w:p>
@@ -1994,7 +3801,168 @@
           <w:sz w:val="28"/>
           <w:szCs w:val="28"/>
         </w:rPr>
-        <w:t>Для выполнения данного задания было выполнено несколько примеров, которые продемонстрированы в методическом указании.</w:t>
+        <w:t xml:space="preserve">Для выполнения данного задания </w:t>
+      </w:r>
+      <w:r>
+        <w:rPr>
+          <w:sz w:val="28"/>
+          <w:szCs w:val="28"/>
+        </w:rPr>
+        <w:t xml:space="preserve">была построена плоскость, которая перпендикулярна плоскости, заданной треугольником </w:t>
+      </w:r>
+      <w:r>
+        <w:rPr>
+          <w:sz w:val="28"/>
+          <w:szCs w:val="28"/>
+          <w:lang w:val="en-US"/>
+        </w:rPr>
+        <w:t>ABC</w:t>
+      </w:r>
+      <w:r>
+        <w:rPr>
+          <w:sz w:val="28"/>
+          <w:szCs w:val="28"/>
+        </w:rPr>
+        <w:t xml:space="preserve">, и проходящей через точку </w:t>
+      </w:r>
+      <w:r>
+        <w:rPr>
+          <w:sz w:val="28"/>
+          <w:szCs w:val="28"/>
+          <w:lang w:val="en-US"/>
+        </w:rPr>
+        <w:t>P</w:t>
+      </w:r>
+      <w:r>
+        <w:rPr>
+          <w:sz w:val="28"/>
+          <w:szCs w:val="28"/>
+        </w:rPr>
+        <w:t>.</w:t>
+      </w:r>
+    </w:p>
+    <w:p>
+      <w:pPr>
+        <w:spacing w:line="360" w:lineRule="auto"/>
+        <w:jc w:val="center"/>
+        <w:rPr>
+          <w:sz w:val="28"/>
+          <w:szCs w:val="28"/>
+        </w:rPr>
+      </w:pPr>
+      <w:r>
+        <w:rPr>
+          <w:sz w:val="28"/>
+          <w:szCs w:val="28"/>
+        </w:rPr>
+        <w:lastRenderedPageBreak/>
+        <w:drawing>
+          <wp:inline distT="0" distB="0" distL="0" distR="0" wp14:anchorId="22F952E8" wp14:editId="55F3F2D8">
+            <wp:extent cx="4628129" cy="3698544"/>
+            <wp:effectExtent l="0" t="0" r="0" b="0"/>
+            <wp:docPr id="18" name="Рисунок 18"/>
+            <wp:cNvGraphicFramePr>
+              <a:graphicFrameLocks xmlns:a="http://schemas.openxmlformats.org/drawingml/2006/main" noChangeAspect="1"/>
+            </wp:cNvGraphicFramePr>
+            <a:graphic xmlns:a="http://schemas.openxmlformats.org/drawingml/2006/main">
+              <a:graphicData uri="http://schemas.openxmlformats.org/drawingml/2006/picture">
+                <pic:pic xmlns:pic="http://schemas.openxmlformats.org/drawingml/2006/picture">
+                  <pic:nvPicPr>
+                    <pic:cNvPr id="1" name=""/>
+                    <pic:cNvPicPr/>
+                  </pic:nvPicPr>
+                  <pic:blipFill>
+                    <a:blip r:embed="rId20"/>
+                    <a:stretch>
+                      <a:fillRect/>
+                    </a:stretch>
+                  </pic:blipFill>
+                  <pic:spPr>
+                    <a:xfrm>
+                      <a:off x="0" y="0"/>
+                      <a:ext cx="4648631" cy="3714928"/>
+                    </a:xfrm>
+                    <a:prstGeom prst="rect">
+                      <a:avLst/>
+                    </a:prstGeom>
+                  </pic:spPr>
+                </pic:pic>
+              </a:graphicData>
+            </a:graphic>
+          </wp:inline>
+        </w:drawing>
+      </w:r>
+    </w:p>
+    <w:p>
+      <w:pPr>
+        <w:spacing w:line="360" w:lineRule="auto"/>
+        <w:jc w:val="center"/>
+        <w:rPr>
+          <w:sz w:val="28"/>
+          <w:szCs w:val="28"/>
+        </w:rPr>
+      </w:pPr>
+      <w:r>
+        <w:rPr>
+          <w:sz w:val="28"/>
+          <w:szCs w:val="28"/>
+        </w:rPr>
+        <w:t>Рисунок 1</w:t>
+      </w:r>
+      <w:r>
+        <w:rPr>
+          <w:sz w:val="28"/>
+          <w:szCs w:val="28"/>
+        </w:rPr>
+        <w:t>5</w:t>
+      </w:r>
+      <w:r>
+        <w:rPr>
+          <w:sz w:val="28"/>
+          <w:szCs w:val="28"/>
+        </w:rPr>
+        <w:t>. Выполнение задания</w:t>
+      </w:r>
+      <w:r>
+        <w:rPr>
+          <w:sz w:val="28"/>
+          <w:szCs w:val="28"/>
+        </w:rPr>
+        <w:t xml:space="preserve"> 8</w:t>
+      </w:r>
+      <w:r>
+        <w:rPr>
+          <w:sz w:val="28"/>
+          <w:szCs w:val="28"/>
+        </w:rPr>
+        <w:t>.</w:t>
+      </w:r>
+    </w:p>
+    <w:p>
+      <w:pPr>
+        <w:spacing w:line="360" w:lineRule="auto"/>
+        <w:jc w:val="center"/>
+        <w:rPr>
+          <w:sz w:val="28"/>
+          <w:szCs w:val="28"/>
+        </w:rPr>
+      </w:pPr>
+    </w:p>
+    <w:p>
+      <w:pPr>
+        <w:spacing w:line="360" w:lineRule="auto"/>
+        <w:jc w:val="center"/>
+        <w:rPr>
+          <w:sz w:val="28"/>
+          <w:szCs w:val="28"/>
+        </w:rPr>
+      </w:pPr>
+      <w:r>
+        <w:rPr>
+          <w:sz w:val="28"/>
+          <w:szCs w:val="28"/>
+        </w:rPr>
+        <w:t>ЗАДАНИЕ 9 (вариант 14).</w:t>
       </w:r>
     </w:p>
     <w:p>
@@ -2007,22 +3975,36 @@
           <w:szCs w:val="28"/>
         </w:rPr>
       </w:pPr>
-    </w:p>
-    <w:p>
-      <w:pPr>
-        <w:spacing w:line="360" w:lineRule="auto"/>
-        <w:jc w:val="center"/>
-        <w:rPr>
-          <w:sz w:val="28"/>
-          <w:szCs w:val="28"/>
-        </w:rPr>
-      </w:pPr>
-      <w:r>
-        <w:rPr>
-          <w:sz w:val="28"/>
-          <w:szCs w:val="28"/>
-        </w:rPr>
-        <w:t>ЗАДАНИЕ 7 (вариант 14).</w:t>
+      <w:r>
+        <w:rPr>
+          <w:sz w:val="28"/>
+          <w:szCs w:val="28"/>
+        </w:rPr>
+        <w:t>Найти линию пересечения построенной в п.8 плоскости и плоскости треугольника ABC</w:t>
+      </w:r>
+      <w:r>
+        <w:rPr>
+          <w:sz w:val="28"/>
+          <w:szCs w:val="28"/>
+        </w:rPr>
+        <w:t>.</w:t>
+      </w:r>
+    </w:p>
+    <w:p>
+      <w:pPr>
+        <w:spacing w:line="360" w:lineRule="auto"/>
+        <w:jc w:val="center"/>
+        <w:rPr>
+          <w:sz w:val="28"/>
+          <w:szCs w:val="28"/>
+        </w:rPr>
+      </w:pPr>
+      <w:r>
+        <w:rPr>
+          <w:sz w:val="28"/>
+          <w:szCs w:val="28"/>
+        </w:rPr>
+        <w:t>ВЫПОЛНЕНИЕ РАБОТЫ:</w:t>
       </w:r>
     </w:p>
     <w:p>
@@ -2032,30 +4014,279 @@
         <w:jc w:val="both"/>
         <w:rPr>
           <w:sz w:val="28"/>
-        </w:rPr>
-      </w:pPr>
-      <w:r>
-        <w:rPr>
-          <w:sz w:val="28"/>
-        </w:rPr>
-        <w:t>Построить плоскость, параллельную плоскости, заданной треугольником ABC, и проходящую через точку P.</w:t>
-      </w:r>
-    </w:p>
-    <w:p>
-      <w:pPr>
-        <w:spacing w:line="360" w:lineRule="auto"/>
-        <w:jc w:val="center"/>
-        <w:rPr>
-          <w:sz w:val="28"/>
-          <w:szCs w:val="28"/>
-        </w:rPr>
-      </w:pPr>
-      <w:r>
-        <w:rPr>
-          <w:sz w:val="28"/>
-          <w:szCs w:val="28"/>
-        </w:rPr>
-        <w:t>ВЫПОЛНЕНИЕ РАБОТЫ:</w:t>
+          <w:szCs w:val="28"/>
+        </w:rPr>
+      </w:pPr>
+      <w:r>
+        <w:rPr>
+          <w:sz w:val="28"/>
+          <w:szCs w:val="28"/>
+        </w:rPr>
+        <w:t xml:space="preserve">Для выполнения данного задания </w:t>
+      </w:r>
+      <w:r>
+        <w:rPr>
+          <w:sz w:val="28"/>
+          <w:szCs w:val="28"/>
+        </w:rPr>
+        <w:t xml:space="preserve">была построена линия пересечения плоскости треугольника </w:t>
+      </w:r>
+      <w:r>
+        <w:rPr>
+          <w:sz w:val="28"/>
+          <w:szCs w:val="28"/>
+          <w:lang w:val="en-US"/>
+        </w:rPr>
+        <w:t>AB</w:t>
+      </w:r>
+      <w:r>
+        <w:rPr>
+          <w:sz w:val="28"/>
+          <w:szCs w:val="28"/>
+        </w:rPr>
+        <w:t>С</w:t>
+      </w:r>
+      <w:r>
+        <w:rPr>
+          <w:sz w:val="28"/>
+          <w:szCs w:val="28"/>
+          <w:lang w:val="en-US"/>
+        </w:rPr>
+        <w:t xml:space="preserve"> </w:t>
+      </w:r>
+      <w:r>
+        <w:rPr>
+          <w:sz w:val="28"/>
+          <w:szCs w:val="28"/>
+        </w:rPr>
+        <w:t>и плоскости, построенной в пункте 8.</w:t>
+      </w:r>
+    </w:p>
+    <w:p>
+      <w:pPr>
+        <w:spacing w:line="360" w:lineRule="auto"/>
+        <w:jc w:val="center"/>
+        <w:rPr>
+          <w:sz w:val="28"/>
+          <w:szCs w:val="28"/>
+        </w:rPr>
+      </w:pPr>
+      <w:r>
+        <w:rPr>
+          <w:sz w:val="28"/>
+          <w:szCs w:val="28"/>
+        </w:rPr>
+        <w:drawing>
+          <wp:inline distT="0" distB="0" distL="0" distR="0" wp14:anchorId="585BD7D0" wp14:editId="7EDB3D57">
+            <wp:extent cx="3814550" cy="2620235"/>
+            <wp:effectExtent l="0" t="0" r="0" b="0"/>
+            <wp:docPr id="19" name="Рисунок 19"/>
+            <wp:cNvGraphicFramePr>
+              <a:graphicFrameLocks xmlns:a="http://schemas.openxmlformats.org/drawingml/2006/main" noChangeAspect="1"/>
+            </wp:cNvGraphicFramePr>
+            <a:graphic xmlns:a="http://schemas.openxmlformats.org/drawingml/2006/main">
+              <a:graphicData uri="http://schemas.openxmlformats.org/drawingml/2006/picture">
+                <pic:pic xmlns:pic="http://schemas.openxmlformats.org/drawingml/2006/picture">
+                  <pic:nvPicPr>
+                    <pic:cNvPr id="1" name=""/>
+                    <pic:cNvPicPr/>
+                  </pic:nvPicPr>
+                  <pic:blipFill>
+                    <a:blip r:embed="rId21"/>
+                    <a:stretch>
+                      <a:fillRect/>
+                    </a:stretch>
+                  </pic:blipFill>
+                  <pic:spPr>
+                    <a:xfrm>
+                      <a:off x="0" y="0"/>
+                      <a:ext cx="3853083" cy="2646703"/>
+                    </a:xfrm>
+                    <a:prstGeom prst="rect">
+                      <a:avLst/>
+                    </a:prstGeom>
+                  </pic:spPr>
+                </pic:pic>
+              </a:graphicData>
+            </a:graphic>
+          </wp:inline>
+        </w:drawing>
+      </w:r>
+    </w:p>
+    <w:p>
+      <w:pPr>
+        <w:spacing w:line="360" w:lineRule="auto"/>
+        <w:jc w:val="center"/>
+        <w:rPr>
+          <w:sz w:val="28"/>
+          <w:szCs w:val="28"/>
+        </w:rPr>
+      </w:pPr>
+      <w:r>
+        <w:rPr>
+          <w:sz w:val="28"/>
+          <w:szCs w:val="28"/>
+        </w:rPr>
+        <w:t>Рисунок 1</w:t>
+      </w:r>
+      <w:r>
+        <w:rPr>
+          <w:sz w:val="28"/>
+          <w:szCs w:val="28"/>
+        </w:rPr>
+        <w:t>6</w:t>
+      </w:r>
+      <w:r>
+        <w:rPr>
+          <w:sz w:val="28"/>
+          <w:szCs w:val="28"/>
+        </w:rPr>
+        <w:t xml:space="preserve">. Выполнение задания </w:t>
+      </w:r>
+      <w:r>
+        <w:rPr>
+          <w:sz w:val="28"/>
+          <w:szCs w:val="28"/>
+        </w:rPr>
+        <w:t>9</w:t>
+      </w:r>
+      <w:r>
+        <w:rPr>
+          <w:sz w:val="28"/>
+          <w:szCs w:val="28"/>
+        </w:rPr>
+        <w:t>.</w:t>
+      </w:r>
+      <w:r>
+        <w:rPr>
+          <w:sz w:val="28"/>
+          <w:szCs w:val="28"/>
+        </w:rPr>
+        <w:t xml:space="preserve"> Часть 1.</w:t>
+      </w:r>
+    </w:p>
+    <w:p>
+      <w:pPr>
+        <w:spacing w:line="360" w:lineRule="auto"/>
+        <w:jc w:val="center"/>
+        <w:rPr>
+          <w:sz w:val="28"/>
+          <w:szCs w:val="28"/>
+        </w:rPr>
+      </w:pPr>
+      <w:r>
+        <w:rPr>
+          <w:sz w:val="28"/>
+          <w:szCs w:val="28"/>
+        </w:rPr>
+        <w:lastRenderedPageBreak/>
+        <w:drawing>
+          <wp:inline distT="0" distB="0" distL="0" distR="0" wp14:anchorId="556E0839" wp14:editId="5A01E06E">
+            <wp:extent cx="4179701" cy="2647666"/>
+            <wp:effectExtent l="0" t="0" r="0" b="0"/>
+            <wp:docPr id="20" name="Рисунок 20"/>
+            <wp:cNvGraphicFramePr>
+              <a:graphicFrameLocks xmlns:a="http://schemas.openxmlformats.org/drawingml/2006/main" noChangeAspect="1"/>
+            </wp:cNvGraphicFramePr>
+            <a:graphic xmlns:a="http://schemas.openxmlformats.org/drawingml/2006/main">
+              <a:graphicData uri="http://schemas.openxmlformats.org/drawingml/2006/picture">
+                <pic:pic xmlns:pic="http://schemas.openxmlformats.org/drawingml/2006/picture">
+                  <pic:nvPicPr>
+                    <pic:cNvPr id="1" name=""/>
+                    <pic:cNvPicPr/>
+                  </pic:nvPicPr>
+                  <pic:blipFill>
+                    <a:blip r:embed="rId22"/>
+                    <a:stretch>
+                      <a:fillRect/>
+                    </a:stretch>
+                  </pic:blipFill>
+                  <pic:spPr>
+                    <a:xfrm>
+                      <a:off x="0" y="0"/>
+                      <a:ext cx="4200057" cy="2660561"/>
+                    </a:xfrm>
+                    <a:prstGeom prst="rect">
+                      <a:avLst/>
+                    </a:prstGeom>
+                  </pic:spPr>
+                </pic:pic>
+              </a:graphicData>
+            </a:graphic>
+          </wp:inline>
+        </w:drawing>
+      </w:r>
+    </w:p>
+    <w:p>
+      <w:pPr>
+        <w:spacing w:line="360" w:lineRule="auto"/>
+        <w:jc w:val="center"/>
+        <w:rPr>
+          <w:sz w:val="28"/>
+          <w:szCs w:val="28"/>
+        </w:rPr>
+      </w:pPr>
+      <w:r>
+        <w:rPr>
+          <w:sz w:val="28"/>
+          <w:szCs w:val="28"/>
+        </w:rPr>
+        <w:t>Рисунок 1</w:t>
+      </w:r>
+      <w:r>
+        <w:rPr>
+          <w:sz w:val="28"/>
+          <w:szCs w:val="28"/>
+        </w:rPr>
+        <w:t>7</w:t>
+      </w:r>
+      <w:r>
+        <w:rPr>
+          <w:sz w:val="28"/>
+          <w:szCs w:val="28"/>
+        </w:rPr>
+        <w:t xml:space="preserve">. Выполнение задания 9. Часть </w:t>
+      </w:r>
+      <w:r>
+        <w:rPr>
+          <w:sz w:val="28"/>
+          <w:szCs w:val="28"/>
+        </w:rPr>
+        <w:t>2</w:t>
+      </w:r>
+      <w:r>
+        <w:rPr>
+          <w:sz w:val="28"/>
+          <w:szCs w:val="28"/>
+        </w:rPr>
+        <w:t>.</w:t>
+      </w:r>
+    </w:p>
+    <w:p>
+      <w:pPr>
+        <w:spacing w:line="360" w:lineRule="auto"/>
+        <w:jc w:val="center"/>
+        <w:rPr>
+          <w:sz w:val="28"/>
+          <w:szCs w:val="28"/>
+        </w:rPr>
+      </w:pPr>
+    </w:p>
+    <w:p>
+      <w:pPr>
+        <w:spacing w:line="360" w:lineRule="auto"/>
+        <w:jc w:val="center"/>
+        <w:rPr>
+          <w:sz w:val="28"/>
+          <w:szCs w:val="28"/>
+        </w:rPr>
+      </w:pPr>
+      <w:r>
+        <w:rPr>
+          <w:sz w:val="28"/>
+          <w:szCs w:val="28"/>
+        </w:rPr>
+        <w:t>ЗАДАНИЕ 10 (вариант 14).</w:t>
       </w:r>
     </w:p>
     <w:p>
@@ -2073,15 +4304,24 @@
           <w:sz w:val="28"/>
           <w:szCs w:val="28"/>
         </w:rPr>
-        <w:t xml:space="preserve">Для выполнения данного задания было выполнено несколько </w:t>
-      </w:r>
-      <w:r>
-        <w:rPr>
-          <w:sz w:val="28"/>
-          <w:szCs w:val="28"/>
-        </w:rPr>
-        <w:lastRenderedPageBreak/>
-        <w:t>примеров, которые продемонстрированы в методическом указании.</w:t>
+        <w:t>Построить плоскость, перпендикулярную плоскостям п. 8.</w:t>
+      </w:r>
+    </w:p>
+    <w:p>
+      <w:pPr>
+        <w:spacing w:line="360" w:lineRule="auto"/>
+        <w:jc w:val="center"/>
+        <w:rPr>
+          <w:sz w:val="28"/>
+          <w:szCs w:val="28"/>
+        </w:rPr>
+      </w:pPr>
+      <w:r>
+        <w:rPr>
+          <w:sz w:val="28"/>
+          <w:szCs w:val="28"/>
+        </w:rPr>
+        <w:t>ВЫПОЛНЕНИЕ РАБОТЫ:</w:t>
       </w:r>
     </w:p>
     <w:p>
@@ -2094,22 +4334,127 @@
           <w:szCs w:val="28"/>
         </w:rPr>
       </w:pPr>
-    </w:p>
-    <w:p>
-      <w:pPr>
-        <w:spacing w:line="360" w:lineRule="auto"/>
-        <w:jc w:val="center"/>
-        <w:rPr>
-          <w:sz w:val="28"/>
-          <w:szCs w:val="28"/>
-        </w:rPr>
-      </w:pPr>
-      <w:r>
-        <w:rPr>
-          <w:sz w:val="28"/>
-          <w:szCs w:val="28"/>
-        </w:rPr>
-        <w:t>ЗАДАНИЕ 8 (вариант 14).</w:t>
+      <w:r>
+        <w:rPr>
+          <w:sz w:val="28"/>
+          <w:szCs w:val="28"/>
+        </w:rPr>
+        <w:t xml:space="preserve">Для выполнения данного задания </w:t>
+      </w:r>
+      <w:r>
+        <w:rPr>
+          <w:sz w:val="28"/>
+          <w:szCs w:val="28"/>
+        </w:rPr>
+        <w:t>была построена плоскость, которая перпендикулярна плоскости, заданной в пункте 8.</w:t>
+      </w:r>
+    </w:p>
+    <w:p>
+      <w:pPr>
+        <w:spacing w:line="360" w:lineRule="auto"/>
+        <w:ind w:firstLine="709"/>
+        <w:jc w:val="center"/>
+        <w:rPr>
+          <w:sz w:val="28"/>
+          <w:szCs w:val="28"/>
+        </w:rPr>
+      </w:pPr>
+      <w:r>
+        <w:rPr>
+          <w:sz w:val="28"/>
+          <w:szCs w:val="28"/>
+        </w:rPr>
+        <w:drawing>
+          <wp:inline distT="0" distB="0" distL="0" distR="0" wp14:anchorId="3FA7087D" wp14:editId="00C626EA">
+            <wp:extent cx="4991778" cy="3916585"/>
+            <wp:effectExtent l="0" t="0" r="0" b="0"/>
+            <wp:docPr id="21" name="Рисунок 21"/>
+            <wp:cNvGraphicFramePr>
+              <a:graphicFrameLocks xmlns:a="http://schemas.openxmlformats.org/drawingml/2006/main" noChangeAspect="1"/>
+            </wp:cNvGraphicFramePr>
+            <a:graphic xmlns:a="http://schemas.openxmlformats.org/drawingml/2006/main">
+              <a:graphicData uri="http://schemas.openxmlformats.org/drawingml/2006/picture">
+                <pic:pic xmlns:pic="http://schemas.openxmlformats.org/drawingml/2006/picture">
+                  <pic:nvPicPr>
+                    <pic:cNvPr id="1" name=""/>
+                    <pic:cNvPicPr/>
+                  </pic:nvPicPr>
+                  <pic:blipFill>
+                    <a:blip r:embed="rId23"/>
+                    <a:stretch>
+                      <a:fillRect/>
+                    </a:stretch>
+                  </pic:blipFill>
+                  <pic:spPr>
+                    <a:xfrm>
+                      <a:off x="0" y="0"/>
+                      <a:ext cx="5008635" cy="3929811"/>
+                    </a:xfrm>
+                    <a:prstGeom prst="rect">
+                      <a:avLst/>
+                    </a:prstGeom>
+                  </pic:spPr>
+                </pic:pic>
+              </a:graphicData>
+            </a:graphic>
+          </wp:inline>
+        </w:drawing>
+      </w:r>
+    </w:p>
+    <w:p>
+      <w:pPr>
+        <w:spacing w:line="360" w:lineRule="auto"/>
+        <w:jc w:val="center"/>
+        <w:rPr>
+          <w:sz w:val="28"/>
+          <w:szCs w:val="28"/>
+        </w:rPr>
+      </w:pPr>
+      <w:r>
+        <w:rPr>
+          <w:sz w:val="28"/>
+          <w:szCs w:val="28"/>
+        </w:rPr>
+        <w:t>Рисунок 1</w:t>
+      </w:r>
+      <w:r>
+        <w:rPr>
+          <w:sz w:val="28"/>
+          <w:szCs w:val="28"/>
+        </w:rPr>
+        <w:t>8</w:t>
+      </w:r>
+      <w:r>
+        <w:rPr>
+          <w:sz w:val="28"/>
+          <w:szCs w:val="28"/>
+        </w:rPr>
+        <w:t xml:space="preserve">. Выполнение задания </w:t>
+      </w:r>
+      <w:r>
+        <w:rPr>
+          <w:sz w:val="28"/>
+          <w:szCs w:val="28"/>
+        </w:rPr>
+        <w:t>10.</w:t>
+      </w:r>
+    </w:p>
+    <w:p>
+      <w:pPr>
+        <w:spacing w:line="360" w:lineRule="auto"/>
+        <w:jc w:val="center"/>
+        <w:rPr>
+          <w:sz w:val="28"/>
+          <w:szCs w:val="28"/>
+        </w:rPr>
+      </w:pPr>
+      <w:r>
+        <w:rPr>
+          <w:sz w:val="28"/>
+          <w:szCs w:val="28"/>
+        </w:rPr>
+        <w:lastRenderedPageBreak/>
+        <w:t>ЗАДАНИЕ 11 (вариант 14).</w:t>
       </w:r>
     </w:p>
     <w:p>
@@ -2127,7 +4472,23 @@
           <w:sz w:val="28"/>
           <w:szCs w:val="28"/>
         </w:rPr>
-        <w:t>Построить плоскость, перпендикулярную плоскости, заданной треугольником ABC, и проходящую через точку P.</w:t>
+        <w:t xml:space="preserve">Построить </w:t>
+      </w:r>
+      <w:proofErr w:type="spellStart"/>
+      <w:r>
+        <w:rPr>
+          <w:sz w:val="28"/>
+          <w:szCs w:val="28"/>
+        </w:rPr>
+        <w:t>биссекторную</w:t>
+      </w:r>
+      <w:proofErr w:type="spellEnd"/>
+      <w:r>
+        <w:rPr>
+          <w:sz w:val="28"/>
+          <w:szCs w:val="28"/>
+        </w:rPr>
+        <w:t xml:space="preserve"> плоскость для плоскостей п. 8.</w:t>
       </w:r>
     </w:p>
     <w:p>
@@ -2155,14 +4516,303 @@
         <w:rPr>
           <w:sz w:val="28"/>
           <w:szCs w:val="28"/>
-        </w:rPr>
-      </w:pPr>
-      <w:r>
-        <w:rPr>
-          <w:sz w:val="28"/>
-          <w:szCs w:val="28"/>
-        </w:rPr>
-        <w:t>Для выполнения данного задания было выполнено несколько примеров, которые продемонстрированы в методическом указании.</w:t>
+          <w:lang w:val="en-US"/>
+        </w:rPr>
+      </w:pPr>
+      <w:r>
+        <w:rPr>
+          <w:sz w:val="28"/>
+          <w:szCs w:val="28"/>
+        </w:rPr>
+        <w:t>Для выполнения данного задания был</w:t>
+      </w:r>
+      <w:r>
+        <w:rPr>
+          <w:sz w:val="28"/>
+          <w:szCs w:val="28"/>
+        </w:rPr>
+        <w:t xml:space="preserve">а построена </w:t>
+      </w:r>
+      <w:proofErr w:type="spellStart"/>
+      <w:r>
+        <w:rPr>
+          <w:sz w:val="28"/>
+          <w:szCs w:val="28"/>
+        </w:rPr>
+        <w:t>биссекторная</w:t>
+      </w:r>
+      <w:proofErr w:type="spellEnd"/>
+      <w:r>
+        <w:rPr>
+          <w:sz w:val="28"/>
+          <w:szCs w:val="28"/>
+        </w:rPr>
+        <w:t xml:space="preserve"> плоскость для плоскости треугольника </w:t>
+      </w:r>
+      <w:r>
+        <w:rPr>
+          <w:sz w:val="28"/>
+          <w:szCs w:val="28"/>
+          <w:lang w:val="en-US"/>
+        </w:rPr>
+        <w:t xml:space="preserve">ABC </w:t>
+      </w:r>
+      <w:r>
+        <w:rPr>
+          <w:sz w:val="28"/>
+          <w:szCs w:val="28"/>
+        </w:rPr>
+        <w:t>и плоскости, построенной в пункте 8.</w:t>
+      </w:r>
+    </w:p>
+    <w:p>
+      <w:pPr>
+        <w:spacing w:line="360" w:lineRule="auto"/>
+        <w:jc w:val="center"/>
+        <w:rPr>
+          <w:sz w:val="28"/>
+          <w:szCs w:val="28"/>
+          <w:lang w:val="en-US"/>
+        </w:rPr>
+      </w:pPr>
+      <w:r>
+        <w:rPr>
+          <w:sz w:val="28"/>
+          <w:szCs w:val="28"/>
+        </w:rPr>
+        <w:drawing>
+          <wp:inline distT="0" distB="0" distL="0" distR="0" wp14:anchorId="76382CE9" wp14:editId="1D47C494">
+            <wp:extent cx="4408630" cy="5486400"/>
+            <wp:effectExtent l="0" t="0" r="0" b="0"/>
+            <wp:docPr id="23" name="Рисунок 23"/>
+            <wp:cNvGraphicFramePr>
+              <a:graphicFrameLocks xmlns:a="http://schemas.openxmlformats.org/drawingml/2006/main" noChangeAspect="1"/>
+            </wp:cNvGraphicFramePr>
+            <a:graphic xmlns:a="http://schemas.openxmlformats.org/drawingml/2006/main">
+              <a:graphicData uri="http://schemas.openxmlformats.org/drawingml/2006/picture">
+                <pic:pic xmlns:pic="http://schemas.openxmlformats.org/drawingml/2006/picture">
+                  <pic:nvPicPr>
+                    <pic:cNvPr id="1" name=""/>
+                    <pic:cNvPicPr/>
+                  </pic:nvPicPr>
+                  <pic:blipFill>
+                    <a:blip r:embed="rId24"/>
+                    <a:stretch>
+                      <a:fillRect/>
+                    </a:stretch>
+                  </pic:blipFill>
+                  <pic:spPr>
+                    <a:xfrm>
+                      <a:off x="0" y="0"/>
+                      <a:ext cx="4416376" cy="5496039"/>
+                    </a:xfrm>
+                    <a:prstGeom prst="rect">
+                      <a:avLst/>
+                    </a:prstGeom>
+                  </pic:spPr>
+                </pic:pic>
+              </a:graphicData>
+            </a:graphic>
+          </wp:inline>
+        </w:drawing>
+      </w:r>
+    </w:p>
+    <w:p>
+      <w:pPr>
+        <w:spacing w:line="360" w:lineRule="auto"/>
+        <w:jc w:val="center"/>
+        <w:rPr>
+          <w:sz w:val="28"/>
+          <w:szCs w:val="28"/>
+        </w:rPr>
+      </w:pPr>
+      <w:r>
+        <w:rPr>
+          <w:sz w:val="28"/>
+          <w:szCs w:val="28"/>
+        </w:rPr>
+        <w:t>Рисунок 18. Выполнение задания 1</w:t>
+      </w:r>
+      <w:r>
+        <w:rPr>
+          <w:sz w:val="28"/>
+          <w:szCs w:val="28"/>
+          <w:lang w:val="en-US"/>
+        </w:rPr>
+        <w:t>1</w:t>
+      </w:r>
+      <w:r>
+        <w:rPr>
+          <w:sz w:val="28"/>
+          <w:szCs w:val="28"/>
+        </w:rPr>
+        <w:t>.</w:t>
+      </w:r>
+      <w:r>
+        <w:rPr>
+          <w:sz w:val="28"/>
+          <w:szCs w:val="28"/>
+          <w:lang w:val="en-US"/>
+        </w:rPr>
+        <w:t xml:space="preserve"> </w:t>
+      </w:r>
+      <w:r>
+        <w:rPr>
+          <w:sz w:val="28"/>
+          <w:szCs w:val="28"/>
+        </w:rPr>
+        <w:t>Часть 1.</w:t>
+      </w:r>
+    </w:p>
+    <w:p>
+      <w:pPr>
+        <w:spacing w:line="360" w:lineRule="auto"/>
+        <w:jc w:val="center"/>
+        <w:rPr>
+          <w:sz w:val="28"/>
+          <w:szCs w:val="28"/>
+        </w:rPr>
+      </w:pPr>
+      <w:r>
+        <w:rPr>
+          <w:sz w:val="28"/>
+          <w:szCs w:val="28"/>
+          <w:lang w:val="en-US"/>
+        </w:rPr>
+        <w:lastRenderedPageBreak/>
+        <w:drawing>
+          <wp:inline distT="0" distB="0" distL="0" distR="0" wp14:anchorId="6F3C87D5" wp14:editId="47A79321">
+            <wp:extent cx="5940425" cy="2957830"/>
+            <wp:effectExtent l="0" t="0" r="0" b="0"/>
+            <wp:docPr id="24" name="Рисунок 24"/>
+            <wp:cNvGraphicFramePr>
+              <a:graphicFrameLocks xmlns:a="http://schemas.openxmlformats.org/drawingml/2006/main" noChangeAspect="1"/>
+            </wp:cNvGraphicFramePr>
+            <a:graphic xmlns:a="http://schemas.openxmlformats.org/drawingml/2006/main">
+              <a:graphicData uri="http://schemas.openxmlformats.org/drawingml/2006/picture">
+                <pic:pic xmlns:pic="http://schemas.openxmlformats.org/drawingml/2006/picture">
+                  <pic:nvPicPr>
+                    <pic:cNvPr id="1" name=""/>
+                    <pic:cNvPicPr/>
+                  </pic:nvPicPr>
+                  <pic:blipFill>
+                    <a:blip r:embed="rId25"/>
+                    <a:stretch>
+                      <a:fillRect/>
+                    </a:stretch>
+                  </pic:blipFill>
+                  <pic:spPr>
+                    <a:xfrm>
+                      <a:off x="0" y="0"/>
+                      <a:ext cx="5940425" cy="2957830"/>
+                    </a:xfrm>
+                    <a:prstGeom prst="rect">
+                      <a:avLst/>
+                    </a:prstGeom>
+                  </pic:spPr>
+                </pic:pic>
+              </a:graphicData>
+            </a:graphic>
+          </wp:inline>
+        </w:drawing>
+      </w:r>
+    </w:p>
+    <w:p>
+      <w:pPr>
+        <w:spacing w:line="360" w:lineRule="auto"/>
+        <w:jc w:val="center"/>
+        <w:rPr>
+          <w:sz w:val="28"/>
+          <w:szCs w:val="28"/>
+        </w:rPr>
+      </w:pPr>
+      <w:r>
+        <w:rPr>
+          <w:sz w:val="28"/>
+          <w:szCs w:val="28"/>
+        </w:rPr>
+        <w:t>Рисунок 1</w:t>
+      </w:r>
+      <w:r>
+        <w:rPr>
+          <w:sz w:val="28"/>
+          <w:szCs w:val="28"/>
+        </w:rPr>
+        <w:t>9</w:t>
+      </w:r>
+      <w:r>
+        <w:rPr>
+          <w:sz w:val="28"/>
+          <w:szCs w:val="28"/>
+        </w:rPr>
+        <w:t>. Выполнение задания 1</w:t>
+      </w:r>
+      <w:r>
+        <w:rPr>
+          <w:sz w:val="28"/>
+          <w:szCs w:val="28"/>
+          <w:lang w:val="en-US"/>
+        </w:rPr>
+        <w:t>1</w:t>
+      </w:r>
+      <w:r>
+        <w:rPr>
+          <w:sz w:val="28"/>
+          <w:szCs w:val="28"/>
+        </w:rPr>
+        <w:t>.</w:t>
+      </w:r>
+      <w:r>
+        <w:rPr>
+          <w:sz w:val="28"/>
+          <w:szCs w:val="28"/>
+          <w:lang w:val="en-US"/>
+        </w:rPr>
+        <w:t xml:space="preserve"> </w:t>
+      </w:r>
+      <w:r>
+        <w:rPr>
+          <w:sz w:val="28"/>
+          <w:szCs w:val="28"/>
+        </w:rPr>
+        <w:t xml:space="preserve">Часть </w:t>
+      </w:r>
+      <w:r>
+        <w:rPr>
+          <w:sz w:val="28"/>
+          <w:szCs w:val="28"/>
+        </w:rPr>
+        <w:t>2</w:t>
+      </w:r>
+      <w:r>
+        <w:rPr>
+          <w:sz w:val="28"/>
+          <w:szCs w:val="28"/>
+        </w:rPr>
+        <w:t>.</w:t>
+      </w:r>
+    </w:p>
+    <w:p>
+      <w:pPr>
+        <w:spacing w:line="360" w:lineRule="auto"/>
+        <w:jc w:val="both"/>
+        <w:rPr>
+          <w:sz w:val="28"/>
+          <w:szCs w:val="28"/>
+        </w:rPr>
+      </w:pPr>
+    </w:p>
+    <w:p>
+      <w:pPr>
+        <w:spacing w:line="360" w:lineRule="auto"/>
+        <w:jc w:val="center"/>
+      </w:pPr>
+      <w:r>
+        <w:rPr>
+          <w:sz w:val="28"/>
+          <w:szCs w:val="28"/>
+        </w:rPr>
+        <w:t>ВЫВОД К РАБОТЕ:</w:t>
       </w:r>
     </w:p>
     <w:p>
@@ -2170,304 +4820,32 @@
         <w:spacing w:line="360" w:lineRule="auto"/>
         <w:ind w:firstLine="709"/>
         <w:jc w:val="both"/>
-        <w:rPr>
-          <w:sz w:val="28"/>
-          <w:szCs w:val="28"/>
-        </w:rPr>
-      </w:pPr>
-    </w:p>
-    <w:p>
-      <w:pPr>
-        <w:spacing w:line="360" w:lineRule="auto"/>
-        <w:jc w:val="center"/>
-        <w:rPr>
-          <w:sz w:val="28"/>
-          <w:szCs w:val="28"/>
-        </w:rPr>
-      </w:pPr>
-      <w:r>
-        <w:rPr>
-          <w:sz w:val="28"/>
-          <w:szCs w:val="28"/>
-        </w:rPr>
-        <w:t>ЗАДАНИЕ 9 (вариант 14).</w:t>
-      </w:r>
-    </w:p>
-    <w:p>
-      <w:pPr>
-        <w:spacing w:line="360" w:lineRule="auto"/>
-        <w:ind w:firstLine="709"/>
-        <w:jc w:val="both"/>
-        <w:rPr>
-          <w:sz w:val="28"/>
-          <w:szCs w:val="28"/>
-        </w:rPr>
-      </w:pPr>
-      <w:r>
-        <w:rPr>
-          <w:sz w:val="28"/>
-          <w:szCs w:val="28"/>
-        </w:rPr>
-        <w:t>Найти линию пересечения построенной в п.8 плоскости и плоскости треугольника ABC</w:t>
-      </w:r>
-      <w:r>
-        <w:rPr>
-          <w:sz w:val="28"/>
-          <w:szCs w:val="28"/>
+      </w:pPr>
+      <w:r>
+        <w:rPr>
+          <w:sz w:val="28"/>
+        </w:rPr>
+        <w:t xml:space="preserve">Я освоил математическое моделирование взаимного положения простых объектов в пространстве в среде </w:t>
+      </w:r>
+      <w:proofErr w:type="spellStart"/>
+      <w:r>
+        <w:rPr>
+          <w:sz w:val="28"/>
+        </w:rPr>
+        <w:t>MathCAD</w:t>
+      </w:r>
+      <w:proofErr w:type="spellEnd"/>
+      <w:r>
+        <w:rPr>
+          <w:sz w:val="28"/>
         </w:rPr>
         <w:t>.</w:t>
       </w:r>
     </w:p>
-    <w:p>
-      <w:pPr>
-        <w:spacing w:line="360" w:lineRule="auto"/>
-        <w:jc w:val="center"/>
-        <w:rPr>
-          <w:sz w:val="28"/>
-          <w:szCs w:val="28"/>
-        </w:rPr>
-      </w:pPr>
-      <w:r>
-        <w:rPr>
-          <w:sz w:val="28"/>
-          <w:szCs w:val="28"/>
-        </w:rPr>
-        <w:t>ВЫПОЛНЕНИЕ РАБОТЫ:</w:t>
-      </w:r>
-    </w:p>
-    <w:p>
-      <w:pPr>
-        <w:spacing w:line="360" w:lineRule="auto"/>
-        <w:ind w:firstLine="709"/>
-        <w:jc w:val="both"/>
-        <w:rPr>
-          <w:sz w:val="28"/>
-          <w:szCs w:val="28"/>
-        </w:rPr>
-      </w:pPr>
-      <w:r>
-        <w:rPr>
-          <w:sz w:val="28"/>
-          <w:szCs w:val="28"/>
-        </w:rPr>
-        <w:t>Для выполнения данного задания было выполнено несколько примеров, которые продемонстрированы в методическом указании.</w:t>
-      </w:r>
-    </w:p>
-    <w:p>
-      <w:pPr>
-        <w:spacing w:line="360" w:lineRule="auto"/>
-        <w:ind w:firstLine="709"/>
-        <w:jc w:val="both"/>
-        <w:rPr>
-          <w:sz w:val="28"/>
-          <w:szCs w:val="28"/>
-        </w:rPr>
-      </w:pPr>
-    </w:p>
-    <w:p>
-      <w:pPr>
-        <w:spacing w:line="360" w:lineRule="auto"/>
-        <w:jc w:val="center"/>
-        <w:rPr>
-          <w:sz w:val="28"/>
-          <w:szCs w:val="28"/>
-        </w:rPr>
-      </w:pPr>
-      <w:r>
-        <w:rPr>
-          <w:sz w:val="28"/>
-          <w:szCs w:val="28"/>
-        </w:rPr>
-        <w:t>ЗАДАНИЕ 10 (вариант 14).</w:t>
-      </w:r>
-    </w:p>
-    <w:p>
-      <w:pPr>
-        <w:spacing w:line="360" w:lineRule="auto"/>
-        <w:ind w:firstLine="709"/>
-        <w:jc w:val="both"/>
-        <w:rPr>
-          <w:sz w:val="28"/>
-          <w:szCs w:val="28"/>
-        </w:rPr>
-      </w:pPr>
-      <w:r>
-        <w:rPr>
-          <w:sz w:val="28"/>
-          <w:szCs w:val="28"/>
-        </w:rPr>
-        <w:t>Построить плоскость, перпендикулярную плоскостям п. 8.</w:t>
-      </w:r>
-    </w:p>
-    <w:p>
-      <w:pPr>
-        <w:spacing w:line="360" w:lineRule="auto"/>
-        <w:jc w:val="center"/>
-        <w:rPr>
-          <w:sz w:val="28"/>
-          <w:szCs w:val="28"/>
-        </w:rPr>
-      </w:pPr>
-      <w:r>
-        <w:rPr>
-          <w:sz w:val="28"/>
-          <w:szCs w:val="28"/>
-        </w:rPr>
-        <w:t>ВЫПОЛНЕНИЕ РАБОТЫ:</w:t>
-      </w:r>
-    </w:p>
-    <w:p>
-      <w:pPr>
-        <w:spacing w:line="360" w:lineRule="auto"/>
-        <w:ind w:firstLine="709"/>
-        <w:jc w:val="both"/>
-        <w:rPr>
-          <w:sz w:val="28"/>
-          <w:szCs w:val="28"/>
-        </w:rPr>
-      </w:pPr>
-      <w:r>
-        <w:rPr>
-          <w:sz w:val="28"/>
-          <w:szCs w:val="28"/>
-        </w:rPr>
-        <w:t>Для выполнения данного задания было выполнено несколько примеров, которые продемонстрированы в методическом указании.</w:t>
-      </w:r>
-    </w:p>
-    <w:p>
-      <w:pPr>
-        <w:spacing w:line="360" w:lineRule="auto"/>
-        <w:ind w:firstLine="709"/>
-        <w:jc w:val="both"/>
-        <w:rPr>
-          <w:sz w:val="28"/>
-          <w:szCs w:val="28"/>
-        </w:rPr>
-      </w:pPr>
-    </w:p>
-    <w:p>
-      <w:pPr>
-        <w:spacing w:line="360" w:lineRule="auto"/>
-        <w:jc w:val="center"/>
-        <w:rPr>
-          <w:sz w:val="28"/>
-          <w:szCs w:val="28"/>
-        </w:rPr>
-      </w:pPr>
-      <w:r>
-        <w:rPr>
-          <w:sz w:val="28"/>
-          <w:szCs w:val="28"/>
-        </w:rPr>
-        <w:t>ЗАДАНИЕ 11 (вариант 14).</w:t>
-      </w:r>
-    </w:p>
-    <w:p>
-      <w:pPr>
-        <w:spacing w:line="360" w:lineRule="auto"/>
-        <w:ind w:firstLine="709"/>
-        <w:jc w:val="both"/>
-        <w:rPr>
-          <w:sz w:val="28"/>
-          <w:szCs w:val="28"/>
-        </w:rPr>
-      </w:pPr>
-      <w:r>
-        <w:rPr>
-          <w:sz w:val="28"/>
-          <w:szCs w:val="28"/>
-        </w:rPr>
-        <w:t>Построить биссекторную плоскость для плоскостей п. 8.</w:t>
-      </w:r>
-    </w:p>
-    <w:p>
-      <w:pPr>
-        <w:spacing w:line="360" w:lineRule="auto"/>
-        <w:jc w:val="center"/>
-        <w:rPr>
-          <w:sz w:val="28"/>
-          <w:szCs w:val="28"/>
-        </w:rPr>
-      </w:pPr>
-      <w:r>
-        <w:rPr>
-          <w:sz w:val="28"/>
-          <w:szCs w:val="28"/>
-        </w:rPr>
-        <w:t>ВЫПОЛНЕНИЕ РАБОТЫ:</w:t>
-      </w:r>
-    </w:p>
-    <w:p>
-      <w:pPr>
-        <w:spacing w:line="360" w:lineRule="auto"/>
-        <w:ind w:firstLine="709"/>
-        <w:jc w:val="both"/>
-        <w:rPr>
-          <w:sz w:val="28"/>
-          <w:szCs w:val="28"/>
-        </w:rPr>
-      </w:pPr>
-      <w:r>
-        <w:rPr>
-          <w:sz w:val="28"/>
-          <w:szCs w:val="28"/>
-        </w:rPr>
-        <w:t>Для выполнения данного задания было выполнено несколько примеров, которые продемонстрированы в методическом указании.</w:t>
-      </w:r>
-    </w:p>
-    <w:p>
-      <w:pPr>
-        <w:spacing w:line="360" w:lineRule="auto"/>
-        <w:ind w:firstLine="709"/>
-        <w:jc w:val="both"/>
-        <w:rPr>
-          <w:sz w:val="28"/>
-          <w:szCs w:val="28"/>
-        </w:rPr>
-      </w:pPr>
-    </w:p>
-    <w:p>
-      <w:pPr>
-        <w:spacing w:line="360" w:lineRule="auto"/>
-        <w:ind w:firstLine="709"/>
-        <w:jc w:val="both"/>
-        <w:rPr>
-          <w:sz w:val="28"/>
-          <w:szCs w:val="28"/>
-        </w:rPr>
-      </w:pPr>
-    </w:p>
-    <w:p>
-      <w:pPr>
-        <w:spacing w:line="360" w:lineRule="auto"/>
-        <w:jc w:val="center"/>
-      </w:pPr>
-      <w:r>
-        <w:rPr>
-          <w:sz w:val="28"/>
-          <w:szCs w:val="28"/>
-        </w:rPr>
-        <w:t>ВЫВОД К РАБОТЕ:</w:t>
-      </w:r>
-    </w:p>
-    <w:p>
-      <w:pPr>
-        <w:spacing w:line="360" w:lineRule="auto"/>
-        <w:ind w:firstLine="709"/>
-        <w:jc w:val="both"/>
-      </w:pPr>
-      <w:r>
-        <w:rPr>
-          <w:sz w:val="28"/>
-        </w:rPr>
-        <w:lastRenderedPageBreak/>
-        <w:t>Я освоил математическое моделирование взаимного положения простых объектов в пространстве в среде MathCAD.</w:t>
-      </w:r>
-    </w:p>
     <w:sectPr>
-      <w:footerReference w:type="even" r:id="rId6"/>
-      <w:footerReference w:type="default" r:id="rId7"/>
-      <w:footerReference w:type="first" r:id="rId8"/>
+      <w:footerReference w:type="even" r:id="rId26"/>
+      <w:footerReference w:type="default" r:id="rId27"/>
+      <w:footerReference w:type="first" r:id="rId28"/>
       <w:pgSz w:w="11906" w:h="16838"/>
       <w:pgMar w:top="1134" w:right="850" w:bottom="1134" w:left="1701" w:header="0" w:footer="708" w:gutter="0"/>
       <w:cols w:space="720"/>
@@ -2977,7 +5355,7 @@
   <w:style w:type="paragraph" w:default="1" w:styleId="a">
     <w:name w:val="Normal"/>
     <w:qFormat/>
-    <w:rsid w:val="001F328D"/>
+    <w:rsid w:val="00945BCD"/>
     <w:pPr>
       <w:widowControl w:val="0"/>
     </w:pPr>

</xml_diff>